<commit_message>
update notes of pronunciation
</commit_message>
<xml_diff>
--- a/Speaking/Pronunciation.docx
+++ b/Speaking/Pronunciation.docx
@@ -6,7 +6,6 @@
       <w:pPr>
         <w:outlineLvl w:val="1"/>
         <w:rPr>
-          <w:rFonts w:hint="eastAsia"/>
           <w:b/>
           <w:sz w:val="32"/>
         </w:rPr>
@@ -30,49 +29,6 @@
             <wp:extent cx="4067175" cy="4511342"/>
             <wp:effectExtent l="0" t="0" r="0" b="3810"/>
             <wp:docPr id="2" name="图片 2"/>
-            <wp:cNvGraphicFramePr>
-              <a:graphicFrameLocks xmlns:a="http://schemas.openxmlformats.org/drawingml/2006/main" noChangeAspect="1"/>
-            </wp:cNvGraphicFramePr>
-            <a:graphic xmlns:a="http://schemas.openxmlformats.org/drawingml/2006/main">
-              <a:graphicData uri="http://schemas.openxmlformats.org/drawingml/2006/picture">
-                <pic:pic xmlns:pic="http://schemas.openxmlformats.org/drawingml/2006/picture">
-                  <pic:nvPicPr>
-                    <pic:cNvPr id="0" name=""/>
-                    <pic:cNvPicPr/>
-                  </pic:nvPicPr>
-                  <pic:blipFill>
-                    <a:blip r:embed="rId6"/>
-                    <a:stretch>
-                      <a:fillRect/>
-                    </a:stretch>
-                  </pic:blipFill>
-                  <pic:spPr>
-                    <a:xfrm>
-                      <a:off x="0" y="0"/>
-                      <a:ext cx="4066667" cy="4510778"/>
-                    </a:xfrm>
-                    <a:prstGeom prst="rect">
-                      <a:avLst/>
-                    </a:prstGeom>
-                  </pic:spPr>
-                </pic:pic>
-              </a:graphicData>
-            </a:graphic>
-          </wp:inline>
-        </w:drawing>
-      </w:r>
-    </w:p>
-    <w:p>
-      <w:r>
-        <w:rPr>
-          <w:noProof/>
-        </w:rPr>
-        <w:lastRenderedPageBreak/>
-        <w:drawing>
-          <wp:inline distT="0" distB="0" distL="0" distR="0" wp14:anchorId="27A0B32B" wp14:editId="5B064F63">
-            <wp:extent cx="5190476" cy="4409524"/>
-            <wp:effectExtent l="0" t="0" r="0" b="0"/>
-            <wp:docPr id="1" name="图片 1"/>
             <wp:cNvGraphicFramePr>
               <a:graphicFrameLocks xmlns:a="http://schemas.openxmlformats.org/drawingml/2006/main" noChangeAspect="1"/>
             </wp:cNvGraphicFramePr>
@@ -92,6 +48,49 @@
                   <pic:spPr>
                     <a:xfrm>
                       <a:off x="0" y="0"/>
+                      <a:ext cx="4066667" cy="4510778"/>
+                    </a:xfrm>
+                    <a:prstGeom prst="rect">
+                      <a:avLst/>
+                    </a:prstGeom>
+                  </pic:spPr>
+                </pic:pic>
+              </a:graphicData>
+            </a:graphic>
+          </wp:inline>
+        </w:drawing>
+      </w:r>
+    </w:p>
+    <w:p>
+      <w:r>
+        <w:rPr>
+          <w:noProof/>
+        </w:rPr>
+        <w:lastRenderedPageBreak/>
+        <w:drawing>
+          <wp:inline distT="0" distB="0" distL="0" distR="0" wp14:anchorId="27A0B32B" wp14:editId="5B064F63">
+            <wp:extent cx="5190476" cy="4409524"/>
+            <wp:effectExtent l="0" t="0" r="0" b="0"/>
+            <wp:docPr id="1" name="图片 1"/>
+            <wp:cNvGraphicFramePr>
+              <a:graphicFrameLocks xmlns:a="http://schemas.openxmlformats.org/drawingml/2006/main" noChangeAspect="1"/>
+            </wp:cNvGraphicFramePr>
+            <a:graphic xmlns:a="http://schemas.openxmlformats.org/drawingml/2006/main">
+              <a:graphicData uri="http://schemas.openxmlformats.org/drawingml/2006/picture">
+                <pic:pic xmlns:pic="http://schemas.openxmlformats.org/drawingml/2006/picture">
+                  <pic:nvPicPr>
+                    <pic:cNvPr id="0" name=""/>
+                    <pic:cNvPicPr/>
+                  </pic:nvPicPr>
+                  <pic:blipFill>
+                    <a:blip r:embed="rId8"/>
+                    <a:stretch>
+                      <a:fillRect/>
+                    </a:stretch>
+                  </pic:blipFill>
+                  <pic:spPr>
+                    <a:xfrm>
+                      <a:off x="0" y="0"/>
                       <a:ext cx="5190476" cy="4409524"/>
                     </a:xfrm>
                     <a:prstGeom prst="rect">
@@ -124,114 +123,294 @@
         <w:rPr>
           <w:rFonts w:ascii="Times New Roman" w:hAnsi="Times New Roman" w:cs="Times New Roman"/>
           <w:sz w:val="24"/>
+        </w:rPr>
+      </w:pPr>
+      <w:r>
+        <w:rPr>
+          <w:rFonts w:ascii="Arial" w:hAnsi="Arial" w:cs="Arial"/>
+          <w:sz w:val="24"/>
+        </w:rPr>
+        <w:t>ʊ</w:t>
+      </w:r>
+      <w:r>
+        <w:rPr>
+          <w:rFonts w:ascii="Arial" w:hAnsi="Arial" w:cs="Arial" w:hint="eastAsia"/>
+          <w:sz w:val="24"/>
+        </w:rPr>
+        <w:t xml:space="preserve">: </w:t>
+      </w:r>
+      <w:r>
+        <w:rPr>
+          <w:rFonts w:ascii="Times New Roman" w:hAnsi="Times New Roman" w:cs="Times New Roman" w:hint="eastAsia"/>
+          <w:sz w:val="24"/>
+        </w:rPr>
+        <w:t xml:space="preserve">The hotkey of </w:t>
+      </w:r>
+      <w:r>
+        <w:rPr>
+          <w:rFonts w:ascii="Times New Roman" w:hAnsi="Times New Roman" w:cs="Times New Roman"/>
+          <w:sz w:val="24"/>
+        </w:rPr>
+        <w:t>‘ʊ’</w:t>
+      </w:r>
+      <w:r>
+        <w:rPr>
+          <w:rFonts w:ascii="Times New Roman" w:hAnsi="Times New Roman" w:cs="Times New Roman" w:hint="eastAsia"/>
+          <w:sz w:val="24"/>
+        </w:rPr>
+        <w:t xml:space="preserve"> is </w:t>
+      </w:r>
+      <w:r>
+        <w:rPr>
+          <w:rFonts w:ascii="Times New Roman" w:hAnsi="Times New Roman" w:cs="Times New Roman"/>
+          <w:sz w:val="24"/>
+        </w:rPr>
+        <w:t>“</w:t>
+      </w:r>
+      <w:r>
+        <w:rPr>
+          <w:rFonts w:ascii="Times New Roman" w:hAnsi="Times New Roman" w:cs="Times New Roman" w:hint="eastAsia"/>
+          <w:sz w:val="24"/>
+        </w:rPr>
+        <w:t>028A</w:t>
+      </w:r>
+      <w:r>
+        <w:rPr>
+          <w:rFonts w:ascii="Times New Roman" w:hAnsi="Times New Roman" w:cs="Times New Roman"/>
+          <w:sz w:val="24"/>
+        </w:rPr>
+        <w:t>”</w:t>
+      </w:r>
+      <w:r>
+        <w:rPr>
+          <w:rFonts w:ascii="Times New Roman" w:hAnsi="Times New Roman" w:cs="Times New Roman" w:hint="eastAsia"/>
+          <w:sz w:val="24"/>
+        </w:rPr>
+        <w:t xml:space="preserve"> and </w:t>
+      </w:r>
+      <w:r>
+        <w:rPr>
+          <w:rFonts w:ascii="Times New Roman" w:hAnsi="Times New Roman" w:cs="Times New Roman"/>
+          <w:sz w:val="24"/>
+        </w:rPr>
+        <w:t>“</w:t>
+      </w:r>
+      <w:r>
+        <w:rPr>
+          <w:rFonts w:ascii="Times New Roman" w:hAnsi="Times New Roman" w:cs="Times New Roman" w:hint="eastAsia"/>
+          <w:sz w:val="24"/>
+        </w:rPr>
+        <w:t>Alt+x</w:t>
+      </w:r>
+      <w:r>
+        <w:rPr>
+          <w:rFonts w:ascii="Times New Roman" w:hAnsi="Times New Roman" w:cs="Times New Roman"/>
+          <w:sz w:val="24"/>
+        </w:rPr>
+        <w:t>”</w:t>
+      </w:r>
+      <w:r>
+        <w:rPr>
+          <w:rFonts w:ascii="Times New Roman" w:hAnsi="Times New Roman" w:cs="Times New Roman" w:hint="eastAsia"/>
+          <w:sz w:val="24"/>
+        </w:rPr>
+        <w:t>. Firstly, input 028A and then press Alt+x</w:t>
+      </w:r>
+      <w:r>
+        <w:rPr>
+          <w:rFonts w:ascii="Times New Roman" w:hAnsi="Times New Roman" w:cs="Times New Roman" w:hint="eastAsia"/>
+          <w:sz w:val="24"/>
+        </w:rPr>
+        <w:t>.</w:t>
+      </w:r>
+    </w:p>
+    <w:p>
+      <w:pPr>
+        <w:rPr>
+          <w:rFonts w:ascii="Times New Roman" w:hAnsi="Times New Roman" w:cs="Times New Roman" w:hint="eastAsia"/>
+          <w:sz w:val="24"/>
+        </w:rPr>
+      </w:pPr>
+      <w:r>
+        <w:rPr>
+          <w:rFonts w:ascii="Times New Roman" w:hAnsi="Times New Roman" w:cs="Times New Roman"/>
+          <w:sz w:val="24"/>
+        </w:rPr>
+        <w:t>ʌ</w:t>
+      </w:r>
+      <w:r>
+        <w:rPr>
+          <w:rFonts w:ascii="Times New Roman" w:hAnsi="Times New Roman" w:cs="Times New Roman" w:hint="eastAsia"/>
+          <w:sz w:val="24"/>
+        </w:rPr>
+        <w:t xml:space="preserve"> : </w:t>
+      </w:r>
+      <w:r>
+        <w:rPr>
+          <w:rFonts w:ascii="Times New Roman" w:hAnsi="Times New Roman" w:cs="Times New Roman"/>
+          <w:sz w:val="24"/>
+        </w:rPr>
+        <w:t>“</w:t>
+      </w:r>
+      <w:r>
+        <w:rPr>
+          <w:rFonts w:ascii="Times New Roman" w:hAnsi="Times New Roman" w:cs="Times New Roman" w:hint="eastAsia"/>
+          <w:sz w:val="24"/>
+        </w:rPr>
+        <w:t>028c</w:t>
+      </w:r>
+      <w:r>
+        <w:rPr>
+          <w:rFonts w:ascii="Times New Roman" w:hAnsi="Times New Roman" w:cs="Times New Roman"/>
+          <w:sz w:val="24"/>
+        </w:rPr>
+        <w:t>”</w:t>
+      </w:r>
+      <w:r>
+        <w:rPr>
+          <w:rFonts w:ascii="Times New Roman" w:hAnsi="Times New Roman" w:cs="Times New Roman" w:hint="eastAsia"/>
+          <w:sz w:val="24"/>
+        </w:rPr>
+        <w:t xml:space="preserve"> + </w:t>
+      </w:r>
+      <w:r>
+        <w:rPr>
+          <w:rFonts w:ascii="Times New Roman" w:hAnsi="Times New Roman" w:cs="Times New Roman"/>
+          <w:sz w:val="24"/>
+        </w:rPr>
+        <w:t>“</w:t>
+      </w:r>
+      <w:r>
+        <w:rPr>
+          <w:rFonts w:ascii="Times New Roman" w:hAnsi="Times New Roman" w:cs="Times New Roman" w:hint="eastAsia"/>
+          <w:sz w:val="24"/>
+        </w:rPr>
+        <w:t>Alt + x</w:t>
+      </w:r>
+      <w:r>
+        <w:rPr>
+          <w:rFonts w:ascii="Times New Roman" w:hAnsi="Times New Roman" w:cs="Times New Roman"/>
+          <w:sz w:val="24"/>
+        </w:rPr>
+        <w:t>”</w:t>
+      </w:r>
+    </w:p>
+    <w:p>
+      <w:pPr>
+        <w:rPr>
+          <w:rFonts w:ascii="Times New Roman" w:hAnsi="Times New Roman" w:cs="Times New Roman"/>
+          <w:sz w:val="24"/>
           <w:lang w:val="en-US"/>
         </w:rPr>
       </w:pPr>
       <w:r>
         <w:rPr>
-          <w:rFonts w:ascii="Arial" w:hAnsi="Arial" w:cs="Arial"/>
-          <w:sz w:val="24"/>
-        </w:rPr>
-        <w:t>ʊ</w:t>
-      </w:r>
-      <w:r>
-        <w:rPr>
-          <w:rFonts w:ascii="Arial" w:hAnsi="Arial" w:cs="Arial" w:hint="eastAsia"/>
-          <w:sz w:val="24"/>
-        </w:rPr>
-        <w:t xml:space="preserve">: </w:t>
-      </w:r>
-      <w:r>
-        <w:rPr>
-          <w:rFonts w:ascii="Times New Roman" w:hAnsi="Times New Roman" w:cs="Times New Roman" w:hint="eastAsia"/>
-          <w:sz w:val="24"/>
-        </w:rPr>
-        <w:t xml:space="preserve">The hotkey of </w:t>
-      </w:r>
-      <w:r>
-        <w:rPr>
-          <w:rFonts w:ascii="Times New Roman" w:hAnsi="Times New Roman" w:cs="Times New Roman"/>
-          <w:sz w:val="24"/>
-        </w:rPr>
-        <w:t>‘ʊ’</w:t>
-      </w:r>
-      <w:r>
-        <w:rPr>
-          <w:rFonts w:ascii="Times New Roman" w:hAnsi="Times New Roman" w:cs="Times New Roman" w:hint="eastAsia"/>
-          <w:sz w:val="24"/>
-        </w:rPr>
-        <w:t xml:space="preserve"> is </w:t>
-      </w:r>
-      <w:r>
-        <w:rPr>
-          <w:rFonts w:ascii="Times New Roman" w:hAnsi="Times New Roman" w:cs="Times New Roman"/>
-          <w:sz w:val="24"/>
-        </w:rPr>
-        <w:t>“</w:t>
-      </w:r>
-      <w:r>
-        <w:rPr>
-          <w:rFonts w:ascii="Times New Roman" w:hAnsi="Times New Roman" w:cs="Times New Roman" w:hint="eastAsia"/>
-          <w:sz w:val="24"/>
-        </w:rPr>
-        <w:t>028A</w:t>
-      </w:r>
-      <w:r>
-        <w:rPr>
-          <w:rFonts w:ascii="Times New Roman" w:hAnsi="Times New Roman" w:cs="Times New Roman"/>
-          <w:sz w:val="24"/>
+          <w:rFonts w:ascii="Times New Roman" w:hAnsi="Times New Roman" w:cs="Times New Roman"/>
+          <w:sz w:val="24"/>
+          <w:lang w:val="en-US"/>
+        </w:rPr>
+        <w:t>ɔ</w:t>
+      </w:r>
+      <w:r>
+        <w:rPr>
+          <w:rFonts w:ascii="Times New Roman" w:hAnsi="Times New Roman" w:cs="Times New Roman" w:hint="eastAsia"/>
+          <w:sz w:val="24"/>
+          <w:lang w:val="en-US"/>
+        </w:rPr>
+        <w:t xml:space="preserve"> :  </w:t>
+      </w:r>
+      <w:r>
+        <w:rPr>
+          <w:rFonts w:ascii="Times New Roman" w:hAnsi="Times New Roman" w:cs="Times New Roman"/>
+          <w:sz w:val="24"/>
+          <w:lang w:val="en-US"/>
+        </w:rPr>
+        <w:t>“0254”</w:t>
+      </w:r>
+      <w:r>
+        <w:rPr>
+          <w:rFonts w:ascii="Times New Roman" w:hAnsi="Times New Roman" w:cs="Times New Roman" w:hint="eastAsia"/>
+          <w:sz w:val="24"/>
+          <w:lang w:val="en-US"/>
+        </w:rPr>
+        <w:t xml:space="preserve"> </w:t>
+      </w:r>
+      <w:r>
+        <w:rPr>
+          <w:rFonts w:ascii="Times New Roman" w:hAnsi="Times New Roman" w:cs="Times New Roman"/>
+          <w:sz w:val="24"/>
+          <w:lang w:val="en-US"/>
+        </w:rPr>
+        <w:t>+</w:t>
+      </w:r>
+      <w:r>
+        <w:rPr>
+          <w:rFonts w:ascii="Times New Roman" w:hAnsi="Times New Roman" w:cs="Times New Roman" w:hint="eastAsia"/>
+          <w:sz w:val="24"/>
+          <w:lang w:val="en-US"/>
+        </w:rPr>
+        <w:t xml:space="preserve"> </w:t>
+      </w:r>
+      <w:r>
+        <w:rPr>
+          <w:rFonts w:ascii="Times New Roman" w:hAnsi="Times New Roman" w:cs="Times New Roman"/>
+          <w:sz w:val="24"/>
+          <w:lang w:val="en-US"/>
+        </w:rPr>
+        <w:t>“Alt</w:t>
+      </w:r>
+      <w:r>
+        <w:rPr>
+          <w:rFonts w:ascii="Times New Roman" w:hAnsi="Times New Roman" w:cs="Times New Roman" w:hint="eastAsia"/>
+          <w:sz w:val="24"/>
+          <w:lang w:val="en-US"/>
+        </w:rPr>
+        <w:t xml:space="preserve"> + </w:t>
+      </w:r>
+      <w:r>
+        <w:rPr>
+          <w:rFonts w:ascii="Times New Roman" w:hAnsi="Times New Roman" w:cs="Times New Roman"/>
+          <w:sz w:val="24"/>
+          <w:lang w:val="en-US"/>
+        </w:rPr>
+        <w:t>x</w:t>
+      </w:r>
+      <w:r>
+        <w:rPr>
+          <w:rFonts w:ascii="Times New Roman" w:hAnsi="Times New Roman" w:cs="Times New Roman"/>
+          <w:sz w:val="24"/>
+          <w:lang w:val="en-US"/>
         </w:rPr>
         <w:t>”</w:t>
       </w:r>
-      <w:r>
-        <w:rPr>
-          <w:rFonts w:ascii="Times New Roman" w:hAnsi="Times New Roman" w:cs="Times New Roman" w:hint="eastAsia"/>
-          <w:sz w:val="24"/>
-        </w:rPr>
-        <w:t xml:space="preserve"> and </w:t>
-      </w:r>
-      <w:r>
-        <w:rPr>
-          <w:rFonts w:ascii="Times New Roman" w:hAnsi="Times New Roman" w:cs="Times New Roman"/>
-          <w:sz w:val="24"/>
-        </w:rPr>
-        <w:t>“</w:t>
-      </w:r>
-      <w:r>
-        <w:rPr>
-          <w:rFonts w:ascii="Times New Roman" w:hAnsi="Times New Roman" w:cs="Times New Roman" w:hint="eastAsia"/>
-          <w:sz w:val="24"/>
-        </w:rPr>
-        <w:t>Alt+x</w:t>
-      </w:r>
-      <w:r>
-        <w:rPr>
-          <w:rFonts w:ascii="Times New Roman" w:hAnsi="Times New Roman" w:cs="Times New Roman"/>
-          <w:sz w:val="24"/>
-        </w:rPr>
-        <w:t>”</w:t>
-      </w:r>
-      <w:r>
-        <w:rPr>
-          <w:rFonts w:ascii="Times New Roman" w:hAnsi="Times New Roman" w:cs="Times New Roman" w:hint="eastAsia"/>
-          <w:sz w:val="24"/>
-        </w:rPr>
-        <w:t>. Firstly, input 028A and then press Alt+x</w:t>
-      </w:r>
-      <w:r>
-        <w:rPr>
-          <w:rFonts w:ascii="Times New Roman" w:hAnsi="Times New Roman" w:cs="Times New Roman" w:hint="eastAsia"/>
-          <w:sz w:val="24"/>
+    </w:p>
+    <w:p>
+      <w:pPr>
+        <w:rPr>
+          <w:rFonts w:ascii="Times New Roman" w:hAnsi="Times New Roman" w:cs="Times New Roman"/>
+          <w:b/>
+          <w:sz w:val="24"/>
+          <w:lang w:val="en-US"/>
+        </w:rPr>
+      </w:pPr>
+      <w:r>
+        <w:rPr>
+          <w:rFonts w:ascii="Times New Roman" w:hAnsi="Times New Roman" w:cs="Times New Roman"/>
+          <w:b/>
+          <w:sz w:val="24"/>
+          <w:lang w:val="en-US"/>
+        </w:rPr>
+        <w:t>N.B. The following notes are specified on the pronunciation of British English</w:t>
+      </w:r>
+      <w:r>
+        <w:rPr>
+          <w:rFonts w:ascii="Times New Roman" w:hAnsi="Times New Roman" w:cs="Times New Roman"/>
+          <w:b/>
+          <w:sz w:val="24"/>
+          <w:lang w:val="en-US"/>
         </w:rPr>
         <w:t>.</w:t>
       </w:r>
-    </w:p>
-    <w:p>
-      <w:pPr>
-        <w:rPr>
-          <w:lang w:val="en-US"/>
-        </w:rPr>
-      </w:pPr>
     </w:p>
     <w:p>
       <w:pPr>
@@ -342,6 +521,7 @@
         <w:rPr>
           <w:rFonts w:hint="eastAsia"/>
         </w:rPr>
+        <w:lastRenderedPageBreak/>
         <w:t xml:space="preserve">For /z/ Air flows and your vocal cords vibrate. </w:t>
       </w:r>
     </w:p>
@@ -388,7 +568,6 @@
         <w:rPr>
           <w:rFonts w:ascii="GWIPA" w:hAnsi="GWIPA"/>
         </w:rPr>
-        <w:lastRenderedPageBreak/>
         <w:t></w:t>
       </w:r>
       <w:r>
@@ -1384,343 +1563,535 @@
         </w:rPr>
         <w:t>n</w:t>
       </w:r>
+      <w:r>
+        <w:rPr>
+          <w:rFonts w:ascii="Times New Roman" w:hAnsi="Times New Roman" w:cs="Times New Roman" w:hint="eastAsia"/>
+          <w:sz w:val="24"/>
+          <w:szCs w:val="24"/>
+        </w:rPr>
+        <w:t xml:space="preserve">ese, but in modern English the tongue moves slightly forward so it is not as same as </w:t>
+      </w:r>
+      <w:r>
+        <w:rPr>
+          <w:rFonts w:ascii="Times New Roman" w:hAnsi="Times New Roman" w:cs="Times New Roman"/>
+          <w:sz w:val="24"/>
+          <w:szCs w:val="24"/>
+        </w:rPr>
+        <w:t>“</w:t>
+      </w:r>
+      <w:r>
+        <w:rPr>
+          <w:rFonts w:ascii="Times New Roman" w:hAnsi="Times New Roman" w:cs="Times New Roman" w:hint="eastAsia"/>
+          <w:sz w:val="24"/>
+          <w:szCs w:val="24"/>
+        </w:rPr>
+        <w:t>tu(</w:t>
+      </w:r>
+      <w:r>
+        <w:rPr>
+          <w:rFonts w:ascii="Times New Roman" w:hAnsi="Times New Roman" w:cs="Times New Roman" w:hint="eastAsia"/>
+          <w:sz w:val="24"/>
+          <w:szCs w:val="24"/>
+        </w:rPr>
+        <w:t>兔</w:t>
+      </w:r>
+      <w:r>
+        <w:rPr>
+          <w:rFonts w:ascii="Times New Roman" w:hAnsi="Times New Roman" w:cs="Times New Roman" w:hint="eastAsia"/>
+          <w:sz w:val="24"/>
+          <w:szCs w:val="24"/>
+        </w:rPr>
+        <w:t>)</w:t>
+      </w:r>
+      <w:r>
+        <w:rPr>
+          <w:rFonts w:ascii="Times New Roman" w:hAnsi="Times New Roman" w:cs="Times New Roman"/>
+          <w:sz w:val="24"/>
+          <w:szCs w:val="24"/>
+        </w:rPr>
+        <w:t>”</w:t>
+      </w:r>
+      <w:r>
+        <w:rPr>
+          <w:rFonts w:ascii="Times New Roman" w:hAnsi="Times New Roman" w:cs="Times New Roman" w:hint="eastAsia"/>
+          <w:sz w:val="24"/>
+          <w:szCs w:val="24"/>
+        </w:rPr>
+        <w:t xml:space="preserve"> any more.</w:t>
+      </w:r>
+    </w:p>
+    <w:p>
+      <w:pPr>
+        <w:rPr>
+          <w:rFonts w:ascii="Times New Roman" w:hAnsi="Times New Roman" w:cs="Times New Roman"/>
+          <w:sz w:val="24"/>
+          <w:szCs w:val="24"/>
+        </w:rPr>
+      </w:pPr>
+      <w:r>
+        <w:rPr>
+          <w:rFonts w:ascii="Times New Roman" w:hAnsi="Times New Roman" w:cs="Times New Roman" w:hint="eastAsia"/>
+          <w:sz w:val="24"/>
+          <w:szCs w:val="24"/>
+        </w:rPr>
+        <w:t>For example, screw, pool.</w:t>
+      </w:r>
+    </w:p>
+    <w:p>
+      <w:pPr>
+        <w:rPr>
+          <w:rFonts w:ascii="Times New Roman" w:hAnsi="Times New Roman" w:cs="Times New Roman"/>
+          <w:sz w:val="24"/>
+          <w:szCs w:val="24"/>
+        </w:rPr>
+      </w:pPr>
+      <w:r>
+        <w:rPr>
+          <w:rFonts w:ascii="Times New Roman" w:hAnsi="Times New Roman" w:cs="Times New Roman" w:hint="eastAsia"/>
+          <w:sz w:val="24"/>
+          <w:szCs w:val="24"/>
+        </w:rPr>
+        <w:t>/u/ It is the short vowel of /u:/.</w:t>
+      </w:r>
+    </w:p>
+    <w:p>
+      <w:pPr>
+        <w:rPr>
+          <w:rFonts w:ascii="Times New Roman" w:hAnsi="Times New Roman" w:cs="Times New Roman"/>
+          <w:sz w:val="24"/>
+          <w:szCs w:val="24"/>
+        </w:rPr>
+      </w:pPr>
+      <w:r>
+        <w:rPr>
+          <w:rFonts w:ascii="Times New Roman" w:hAnsi="Times New Roman" w:cs="Times New Roman" w:hint="eastAsia"/>
+          <w:sz w:val="24"/>
+          <w:szCs w:val="24"/>
+        </w:rPr>
+        <w:t>/</w:t>
+      </w:r>
+      <w:r>
+        <w:rPr>
+          <w:rFonts w:ascii="Times New Roman" w:hAnsi="Times New Roman" w:cs="Times New Roman"/>
+          <w:sz w:val="24"/>
+          <w:szCs w:val="24"/>
+        </w:rPr>
+        <w:t>ʊ</w:t>
+      </w:r>
+      <w:r>
+        <w:rPr>
+          <w:rFonts w:ascii="Times New Roman" w:hAnsi="Times New Roman" w:cs="Times New Roman" w:hint="eastAsia"/>
+          <w:sz w:val="24"/>
+          <w:szCs w:val="24"/>
+        </w:rPr>
+        <w:t>/ Note that /</w:t>
+      </w:r>
+      <w:r>
+        <w:rPr>
+          <w:rFonts w:ascii="Times New Roman" w:hAnsi="Times New Roman" w:cs="Times New Roman"/>
+          <w:sz w:val="24"/>
+          <w:szCs w:val="24"/>
+        </w:rPr>
+        <w:t>ʊ</w:t>
+      </w:r>
+      <w:r>
+        <w:rPr>
+          <w:rFonts w:ascii="Times New Roman" w:hAnsi="Times New Roman" w:cs="Times New Roman" w:hint="eastAsia"/>
+          <w:sz w:val="24"/>
+          <w:szCs w:val="24"/>
+        </w:rPr>
+        <w:t>/ is not the short vowel of /u:/. Your tongue is slightly lower and more forward thant that of /u:/ and /u/. Your mouth is also round but you should relax and it is not so round.</w:t>
+      </w:r>
+      <w:r>
+        <w:rPr>
+          <w:rFonts w:ascii="Times New Roman" w:hAnsi="Times New Roman" w:cs="Times New Roman" w:hint="eastAsia"/>
+          <w:sz w:val="24"/>
+          <w:szCs w:val="24"/>
+        </w:rPr>
+        <w:t xml:space="preserve"> Don</w:t>
+      </w:r>
+      <w:r>
+        <w:rPr>
+          <w:rFonts w:ascii="Times New Roman" w:hAnsi="Times New Roman" w:cs="Times New Roman"/>
+          <w:sz w:val="24"/>
+          <w:szCs w:val="24"/>
+        </w:rPr>
+        <w:t>’</w:t>
+      </w:r>
+      <w:r>
+        <w:rPr>
+          <w:rFonts w:ascii="Times New Roman" w:hAnsi="Times New Roman" w:cs="Times New Roman" w:hint="eastAsia"/>
+          <w:sz w:val="24"/>
+          <w:szCs w:val="24"/>
+        </w:rPr>
+        <w:t>t put your lips too forward.</w:t>
+      </w:r>
+      <w:r>
+        <w:rPr>
+          <w:rFonts w:ascii="Times New Roman" w:hAnsi="Times New Roman" w:cs="Times New Roman" w:hint="eastAsia"/>
+          <w:sz w:val="24"/>
+          <w:szCs w:val="24"/>
+        </w:rPr>
+        <w:t xml:space="preserve"> </w:t>
+      </w:r>
+      <w:r>
+        <w:rPr>
+          <w:rFonts w:ascii="Times New Roman" w:hAnsi="Times New Roman" w:cs="Times New Roman" w:hint="eastAsia"/>
+          <w:sz w:val="24"/>
+          <w:szCs w:val="24"/>
+        </w:rPr>
+        <w:t xml:space="preserve">There is not any </w:t>
+      </w:r>
+      <w:r>
+        <w:rPr>
+          <w:rFonts w:ascii="Times New Roman" w:hAnsi="Times New Roman" w:cs="Times New Roman" w:hint="eastAsia"/>
+          <w:sz w:val="24"/>
+          <w:szCs w:val="24"/>
+        </w:rPr>
+        <w:t>equivalent</w:t>
+      </w:r>
+      <w:r>
+        <w:rPr>
+          <w:rFonts w:ascii="Times New Roman" w:hAnsi="Times New Roman" w:cs="Times New Roman" w:hint="eastAsia"/>
+          <w:sz w:val="24"/>
+          <w:szCs w:val="24"/>
+        </w:rPr>
+        <w:t xml:space="preserve"> sound in Chinese.</w:t>
+      </w:r>
+      <w:r>
+        <w:rPr>
+          <w:rFonts w:ascii="Times New Roman" w:hAnsi="Times New Roman" w:cs="Times New Roman" w:hint="eastAsia"/>
+          <w:sz w:val="24"/>
+          <w:szCs w:val="24"/>
+        </w:rPr>
+        <w:t xml:space="preserve"> </w:t>
+      </w:r>
+    </w:p>
+    <w:p>
+      <w:pPr>
+        <w:rPr>
+          <w:rFonts w:ascii="Times New Roman" w:hAnsi="Times New Roman" w:cs="Times New Roman"/>
+          <w:sz w:val="24"/>
+          <w:szCs w:val="24"/>
+        </w:rPr>
+      </w:pPr>
+      <w:r>
+        <w:rPr>
+          <w:rFonts w:ascii="Times New Roman" w:hAnsi="Times New Roman" w:cs="Times New Roman" w:hint="eastAsia"/>
+          <w:sz w:val="24"/>
+          <w:szCs w:val="24"/>
+        </w:rPr>
+        <w:t>For instance, book, look, good, took, bush, would.</w:t>
+      </w:r>
+    </w:p>
+    <w:p>
+      <w:pPr>
+        <w:rPr>
+          <w:rFonts w:ascii="Times New Roman" w:hAnsi="Times New Roman" w:cs="Times New Roman"/>
+          <w:sz w:val="24"/>
+          <w:szCs w:val="24"/>
+        </w:rPr>
+      </w:pPr>
+      <w:r>
+        <w:rPr>
+          <w:rFonts w:ascii="Times New Roman" w:hAnsi="Times New Roman" w:cs="Times New Roman" w:hint="eastAsia"/>
+          <w:sz w:val="24"/>
+          <w:szCs w:val="24"/>
+        </w:rPr>
+        <w:t>Compare, pool /</w:t>
+      </w:r>
+      <w:r>
+        <w:rPr>
+          <w:rFonts w:ascii="Times New Roman" w:hAnsi="Times New Roman" w:cs="Times New Roman" w:hint="eastAsia"/>
+          <w:sz w:val="24"/>
+          <w:szCs w:val="24"/>
+        </w:rPr>
+        <w:t>p</w:t>
+      </w:r>
+      <w:r>
+        <w:rPr>
+          <w:rFonts w:ascii="Times New Roman" w:hAnsi="Times New Roman" w:cs="Times New Roman" w:hint="eastAsia"/>
+          <w:sz w:val="24"/>
+          <w:szCs w:val="24"/>
+        </w:rPr>
+        <w:t>u:</w:t>
+      </w:r>
+      <w:r>
+        <w:rPr>
+          <w:rFonts w:ascii="Times New Roman" w:hAnsi="Times New Roman" w:cs="Times New Roman" w:hint="eastAsia"/>
+          <w:sz w:val="24"/>
+          <w:szCs w:val="24"/>
+        </w:rPr>
+        <w:t>l</w:t>
+      </w:r>
+      <w:r>
+        <w:rPr>
+          <w:rFonts w:ascii="Times New Roman" w:hAnsi="Times New Roman" w:cs="Times New Roman" w:hint="eastAsia"/>
+          <w:sz w:val="24"/>
+          <w:szCs w:val="24"/>
+        </w:rPr>
+        <w:t>/ and pull /</w:t>
+      </w:r>
+      <w:r>
+        <w:rPr>
+          <w:rFonts w:ascii="Times New Roman" w:hAnsi="Times New Roman" w:cs="Times New Roman" w:hint="eastAsia"/>
+          <w:sz w:val="24"/>
+          <w:szCs w:val="24"/>
+        </w:rPr>
+        <w:t>p</w:t>
+      </w:r>
+      <w:r>
+        <w:rPr>
+          <w:rFonts w:ascii="Times New Roman" w:hAnsi="Times New Roman" w:cs="Times New Roman"/>
+          <w:sz w:val="24"/>
+          <w:szCs w:val="24"/>
+        </w:rPr>
+        <w:t>ʊ</w:t>
+      </w:r>
+      <w:r>
+        <w:rPr>
+          <w:rFonts w:ascii="Times New Roman" w:hAnsi="Times New Roman" w:cs="Times New Roman" w:hint="eastAsia"/>
+          <w:sz w:val="24"/>
+          <w:szCs w:val="24"/>
+        </w:rPr>
+        <w:t>l</w:t>
+      </w:r>
+      <w:r>
+        <w:rPr>
+          <w:rFonts w:ascii="Times New Roman" w:hAnsi="Times New Roman" w:cs="Times New Roman" w:hint="eastAsia"/>
+          <w:sz w:val="24"/>
+          <w:szCs w:val="24"/>
+        </w:rPr>
+        <w:t>/.</w:t>
+      </w:r>
+    </w:p>
+    <w:p>
+      <w:pPr>
+        <w:outlineLvl w:val="1"/>
+        <w:rPr>
+          <w:rFonts w:ascii="Times New Roman" w:hAnsi="Times New Roman" w:cs="Times New Roman"/>
+          <w:b/>
+          <w:sz w:val="32"/>
+        </w:rPr>
+      </w:pPr>
+      <w:r>
+        <w:rPr>
+          <w:rFonts w:ascii="Times New Roman" w:hAnsi="Times New Roman" w:cs="Times New Roman" w:hint="eastAsia"/>
+          <w:b/>
+          <w:sz w:val="32"/>
+        </w:rPr>
+        <w:t>4. /e/</w:t>
+      </w:r>
+    </w:p>
+    <w:p>
+      <w:pPr>
+        <w:rPr>
+          <w:rFonts w:ascii="Times New Roman" w:hAnsi="Times New Roman" w:cs="Times New Roman"/>
+          <w:sz w:val="24"/>
+          <w:szCs w:val="24"/>
+        </w:rPr>
+      </w:pPr>
+      <w:r>
+        <w:rPr>
+          <w:rFonts w:ascii="Times New Roman" w:hAnsi="Times New Roman" w:cs="Times New Roman" w:hint="eastAsia"/>
+          <w:sz w:val="24"/>
+          <w:szCs w:val="24"/>
+        </w:rPr>
+        <w:t>/e/ is a short vowel.</w:t>
+      </w:r>
+    </w:p>
+    <w:p>
+      <w:pPr>
+        <w:outlineLvl w:val="1"/>
+        <w:rPr>
+          <w:rFonts w:ascii="Times New Roman" w:hAnsi="Times New Roman" w:cs="Times New Roman"/>
+          <w:b/>
+          <w:sz w:val="32"/>
+        </w:rPr>
+      </w:pPr>
+      <w:r>
+        <w:rPr>
+          <w:rFonts w:ascii="Times New Roman" w:hAnsi="Times New Roman" w:cs="Times New Roman" w:hint="eastAsia"/>
+          <w:b/>
+          <w:sz w:val="32"/>
+        </w:rPr>
+        <w:t>5. /</w:t>
+      </w:r>
+      <w:r>
+        <w:rPr>
+          <w:rFonts w:ascii="Times New Roman" w:hAnsi="Times New Roman" w:cs="Times New Roman"/>
+          <w:b/>
+          <w:sz w:val="32"/>
+        </w:rPr>
+        <w:t>ʌ</w:t>
+      </w:r>
+      <w:r>
+        <w:rPr>
+          <w:rFonts w:ascii="Times New Roman" w:hAnsi="Times New Roman" w:cs="Times New Roman" w:hint="eastAsia"/>
+          <w:b/>
+          <w:sz w:val="32"/>
+        </w:rPr>
+        <w:t>/</w:t>
+      </w:r>
+    </w:p>
+    <w:p>
+      <w:pPr>
+        <w:rPr>
+          <w:rFonts w:ascii="Times New Roman" w:hAnsi="Times New Roman" w:cs="Times New Roman" w:hint="eastAsia"/>
+          <w:sz w:val="24"/>
+          <w:szCs w:val="24"/>
+        </w:rPr>
+      </w:pPr>
+      <w:r>
+        <w:rPr>
+          <w:rFonts w:ascii="Times New Roman" w:hAnsi="Times New Roman" w:cs="Times New Roman" w:hint="eastAsia"/>
+          <w:sz w:val="24"/>
+          <w:szCs w:val="24"/>
+        </w:rPr>
+        <w:t>When you articulate /</w:t>
+      </w:r>
+      <w:r>
+        <w:rPr>
+          <w:rFonts w:ascii="GWIPA" w:hAnsi="GWIPA" w:cs="Times New Roman"/>
+          <w:sz w:val="24"/>
+          <w:szCs w:val="24"/>
+        </w:rPr>
+        <w:t></w:t>
+      </w:r>
+      <w:r>
+        <w:rPr>
+          <w:rFonts w:ascii="Times New Roman" w:hAnsi="Times New Roman" w:cs="Times New Roman" w:hint="eastAsia"/>
+          <w:sz w:val="24"/>
+          <w:szCs w:val="24"/>
+        </w:rPr>
+        <w:t xml:space="preserve">/ your tongue is slightly higher than when you articulate Chinese </w:t>
+      </w:r>
+      <w:r>
+        <w:rPr>
+          <w:rFonts w:ascii="Times New Roman" w:hAnsi="Times New Roman" w:cs="Times New Roman"/>
+          <w:sz w:val="24"/>
+          <w:szCs w:val="24"/>
+        </w:rPr>
+        <w:t>“</w:t>
+      </w:r>
+      <w:r>
+        <w:rPr>
+          <w:rFonts w:ascii="Times New Roman" w:hAnsi="Times New Roman" w:cs="Times New Roman" w:hint="eastAsia"/>
+          <w:sz w:val="24"/>
+          <w:szCs w:val="24"/>
+        </w:rPr>
+        <w:t>a</w:t>
+      </w:r>
+      <w:r>
+        <w:rPr>
+          <w:rFonts w:ascii="Times New Roman" w:hAnsi="Times New Roman" w:cs="Times New Roman"/>
+          <w:sz w:val="24"/>
+          <w:szCs w:val="24"/>
+        </w:rPr>
+        <w:t>”</w:t>
+      </w:r>
+      <w:r>
+        <w:rPr>
+          <w:rFonts w:ascii="Times New Roman" w:hAnsi="Times New Roman" w:cs="Times New Roman" w:hint="eastAsia"/>
+          <w:sz w:val="24"/>
+          <w:szCs w:val="24"/>
+        </w:rPr>
+        <w:t>.</w:t>
+      </w:r>
+    </w:p>
+    <w:p>
+      <w:pPr>
+        <w:rPr>
+          <w:rFonts w:ascii="Times New Roman" w:hAnsi="Times New Roman" w:cs="Times New Roman" w:hint="eastAsia"/>
+          <w:sz w:val="24"/>
+          <w:szCs w:val="24"/>
+        </w:rPr>
+      </w:pPr>
+    </w:p>
+    <w:p>
+      <w:pPr>
+        <w:outlineLvl w:val="1"/>
+        <w:rPr>
+          <w:rFonts w:ascii="Times New Roman" w:hAnsi="Times New Roman" w:cs="Times New Roman" w:hint="eastAsia"/>
+          <w:b/>
+          <w:sz w:val="32"/>
+        </w:rPr>
+      </w:pPr>
+      <w:r>
+        <w:rPr>
+          <w:rFonts w:ascii="Times New Roman" w:hAnsi="Times New Roman" w:cs="Times New Roman" w:hint="eastAsia"/>
+          <w:b/>
+          <w:sz w:val="32"/>
+        </w:rPr>
+        <w:lastRenderedPageBreak/>
+        <w:t>6 /</w:t>
+      </w:r>
+      <w:r>
+        <w:rPr>
+          <w:rFonts w:ascii="Arial" w:hAnsi="Arial" w:cs="Arial"/>
+          <w:b/>
+          <w:sz w:val="32"/>
+        </w:rPr>
+        <w:t>ɔ</w:t>
+      </w:r>
+      <w:r>
+        <w:rPr>
+          <w:rFonts w:ascii="Times New Roman" w:hAnsi="Times New Roman" w:cs="Times New Roman" w:hint="eastAsia"/>
+          <w:b/>
+          <w:sz w:val="32"/>
+        </w:rPr>
+        <w:t>/</w:t>
+      </w:r>
+      <w:r>
+        <w:rPr>
+          <w:rFonts w:ascii="Times New Roman" w:hAnsi="Times New Roman" w:cs="Times New Roman" w:hint="eastAsia"/>
+          <w:b/>
+          <w:sz w:val="32"/>
+        </w:rPr>
+        <w:t xml:space="preserve">  </w:t>
+      </w:r>
       <w:bookmarkStart w:id="0" w:name="_GoBack"/>
       <w:bookmarkEnd w:id="0"/>
-      <w:r>
-        <w:rPr>
-          <w:rFonts w:ascii="Times New Roman" w:hAnsi="Times New Roman" w:cs="Times New Roman" w:hint="eastAsia"/>
-          <w:sz w:val="24"/>
-          <w:szCs w:val="24"/>
-        </w:rPr>
-        <w:t xml:space="preserve">ese, but in modern English the tongue moves slightly forward so it is not as same as </w:t>
-      </w:r>
-      <w:r>
-        <w:rPr>
-          <w:rFonts w:ascii="Times New Roman" w:hAnsi="Times New Roman" w:cs="Times New Roman"/>
-          <w:sz w:val="24"/>
-          <w:szCs w:val="24"/>
-        </w:rPr>
-        <w:t>“</w:t>
-      </w:r>
-      <w:r>
-        <w:rPr>
-          <w:rFonts w:ascii="Times New Roman" w:hAnsi="Times New Roman" w:cs="Times New Roman" w:hint="eastAsia"/>
-          <w:sz w:val="24"/>
-          <w:szCs w:val="24"/>
-        </w:rPr>
-        <w:t>tu(</w:t>
-      </w:r>
-      <w:r>
-        <w:rPr>
-          <w:rFonts w:ascii="Times New Roman" w:hAnsi="Times New Roman" w:cs="Times New Roman" w:hint="eastAsia"/>
-          <w:sz w:val="24"/>
-          <w:szCs w:val="24"/>
-        </w:rPr>
-        <w:t>兔</w:t>
-      </w:r>
-      <w:r>
-        <w:rPr>
-          <w:rFonts w:ascii="Times New Roman" w:hAnsi="Times New Roman" w:cs="Times New Roman" w:hint="eastAsia"/>
-          <w:sz w:val="24"/>
-          <w:szCs w:val="24"/>
-        </w:rPr>
-        <w:t>)</w:t>
-      </w:r>
-      <w:r>
-        <w:rPr>
-          <w:rFonts w:ascii="Times New Roman" w:hAnsi="Times New Roman" w:cs="Times New Roman"/>
-          <w:sz w:val="24"/>
-          <w:szCs w:val="24"/>
-        </w:rPr>
-        <w:t>”</w:t>
-      </w:r>
-      <w:r>
-        <w:rPr>
-          <w:rFonts w:ascii="Times New Roman" w:hAnsi="Times New Roman" w:cs="Times New Roman" w:hint="eastAsia"/>
-          <w:sz w:val="24"/>
-          <w:szCs w:val="24"/>
-        </w:rPr>
-        <w:t xml:space="preserve"> any more.</w:t>
-      </w:r>
-    </w:p>
-    <w:p>
-      <w:pPr>
-        <w:rPr>
-          <w:rFonts w:ascii="Times New Roman" w:hAnsi="Times New Roman" w:cs="Times New Roman"/>
-          <w:sz w:val="24"/>
-          <w:szCs w:val="24"/>
-        </w:rPr>
-      </w:pPr>
-      <w:r>
-        <w:rPr>
-          <w:rFonts w:ascii="Times New Roman" w:hAnsi="Times New Roman" w:cs="Times New Roman" w:hint="eastAsia"/>
-          <w:sz w:val="24"/>
-          <w:szCs w:val="24"/>
-        </w:rPr>
-        <w:t>For example, screw, pool.</w:t>
-      </w:r>
-    </w:p>
-    <w:p>
-      <w:pPr>
-        <w:rPr>
-          <w:rFonts w:ascii="Times New Roman" w:hAnsi="Times New Roman" w:cs="Times New Roman"/>
-          <w:sz w:val="24"/>
-          <w:szCs w:val="24"/>
-        </w:rPr>
-      </w:pPr>
-      <w:r>
-        <w:rPr>
-          <w:rFonts w:ascii="Times New Roman" w:hAnsi="Times New Roman" w:cs="Times New Roman" w:hint="eastAsia"/>
-          <w:sz w:val="24"/>
-          <w:szCs w:val="24"/>
-        </w:rPr>
-        <w:t>/u/ It is the short vowel of /u:/.</w:t>
-      </w:r>
-    </w:p>
-    <w:p>
-      <w:pPr>
-        <w:rPr>
-          <w:rFonts w:ascii="Times New Roman" w:hAnsi="Times New Roman" w:cs="Times New Roman"/>
-          <w:sz w:val="24"/>
-          <w:szCs w:val="24"/>
-        </w:rPr>
-      </w:pPr>
-      <w:r>
-        <w:rPr>
-          <w:rFonts w:ascii="Times New Roman" w:hAnsi="Times New Roman" w:cs="Times New Roman" w:hint="eastAsia"/>
-          <w:sz w:val="24"/>
-          <w:szCs w:val="24"/>
-        </w:rPr>
-        <w:t>/</w:t>
-      </w:r>
-      <w:r>
-        <w:rPr>
-          <w:rFonts w:ascii="Times New Roman" w:hAnsi="Times New Roman" w:cs="Times New Roman"/>
-          <w:sz w:val="24"/>
-          <w:szCs w:val="24"/>
-        </w:rPr>
-        <w:t>ʊ</w:t>
-      </w:r>
-      <w:r>
-        <w:rPr>
-          <w:rFonts w:ascii="Times New Roman" w:hAnsi="Times New Roman" w:cs="Times New Roman" w:hint="eastAsia"/>
-          <w:sz w:val="24"/>
-          <w:szCs w:val="24"/>
-        </w:rPr>
-        <w:t>/ Note that /</w:t>
-      </w:r>
-      <w:r>
-        <w:rPr>
-          <w:rFonts w:ascii="Times New Roman" w:hAnsi="Times New Roman" w:cs="Times New Roman"/>
-          <w:sz w:val="24"/>
-          <w:szCs w:val="24"/>
-        </w:rPr>
-        <w:t>ʊ</w:t>
-      </w:r>
-      <w:r>
-        <w:rPr>
-          <w:rFonts w:ascii="Times New Roman" w:hAnsi="Times New Roman" w:cs="Times New Roman" w:hint="eastAsia"/>
-          <w:sz w:val="24"/>
-          <w:szCs w:val="24"/>
-        </w:rPr>
-        <w:t>/ is not the short vowel of /u:/. Your tongue is slightly lower and more forward thant that of /u:/ and /u/. Your mouth is also round but you should relax and it is not so round.</w:t>
-      </w:r>
-      <w:r>
-        <w:rPr>
-          <w:rFonts w:ascii="Times New Roman" w:hAnsi="Times New Roman" w:cs="Times New Roman" w:hint="eastAsia"/>
-          <w:sz w:val="24"/>
-          <w:szCs w:val="24"/>
-        </w:rPr>
-        <w:t xml:space="preserve"> Don</w:t>
-      </w:r>
-      <w:r>
-        <w:rPr>
-          <w:rFonts w:ascii="Times New Roman" w:hAnsi="Times New Roman" w:cs="Times New Roman"/>
-          <w:sz w:val="24"/>
-          <w:szCs w:val="24"/>
-        </w:rPr>
-        <w:t>’</w:t>
-      </w:r>
-      <w:r>
-        <w:rPr>
-          <w:rFonts w:ascii="Times New Roman" w:hAnsi="Times New Roman" w:cs="Times New Roman" w:hint="eastAsia"/>
-          <w:sz w:val="24"/>
-          <w:szCs w:val="24"/>
-        </w:rPr>
-        <w:t>t put your lips too forward.</w:t>
-      </w:r>
-      <w:r>
-        <w:rPr>
-          <w:rFonts w:ascii="Times New Roman" w:hAnsi="Times New Roman" w:cs="Times New Roman" w:hint="eastAsia"/>
-          <w:sz w:val="24"/>
-          <w:szCs w:val="24"/>
-        </w:rPr>
-        <w:t xml:space="preserve"> </w:t>
-      </w:r>
-      <w:r>
-        <w:rPr>
-          <w:rFonts w:ascii="Times New Roman" w:hAnsi="Times New Roman" w:cs="Times New Roman" w:hint="eastAsia"/>
-          <w:sz w:val="24"/>
-          <w:szCs w:val="24"/>
-        </w:rPr>
-        <w:t xml:space="preserve">There is not any </w:t>
-      </w:r>
-      <w:r>
-        <w:rPr>
-          <w:rFonts w:ascii="Times New Roman" w:hAnsi="Times New Roman" w:cs="Times New Roman" w:hint="eastAsia"/>
-          <w:sz w:val="24"/>
-          <w:szCs w:val="24"/>
-        </w:rPr>
-        <w:t>equivalent</w:t>
-      </w:r>
-      <w:r>
-        <w:rPr>
-          <w:rFonts w:ascii="Times New Roman" w:hAnsi="Times New Roman" w:cs="Times New Roman" w:hint="eastAsia"/>
-          <w:sz w:val="24"/>
-          <w:szCs w:val="24"/>
-        </w:rPr>
-        <w:t xml:space="preserve"> sound in Chinese.</w:t>
-      </w:r>
-      <w:r>
-        <w:rPr>
-          <w:rFonts w:ascii="Times New Roman" w:hAnsi="Times New Roman" w:cs="Times New Roman" w:hint="eastAsia"/>
-          <w:sz w:val="24"/>
-          <w:szCs w:val="24"/>
-        </w:rPr>
-        <w:t xml:space="preserve"> </w:t>
-      </w:r>
-    </w:p>
-    <w:p>
-      <w:pPr>
-        <w:rPr>
-          <w:rFonts w:ascii="Times New Roman" w:hAnsi="Times New Roman" w:cs="Times New Roman"/>
-          <w:sz w:val="24"/>
-          <w:szCs w:val="24"/>
-        </w:rPr>
-      </w:pPr>
-      <w:r>
-        <w:rPr>
-          <w:rFonts w:ascii="Times New Roman" w:hAnsi="Times New Roman" w:cs="Times New Roman" w:hint="eastAsia"/>
-          <w:sz w:val="24"/>
-          <w:szCs w:val="24"/>
-        </w:rPr>
-        <w:t>For instance, book, look, good, took, bush, would.</w:t>
-      </w:r>
-    </w:p>
-    <w:p>
-      <w:pPr>
-        <w:rPr>
-          <w:rFonts w:ascii="Times New Roman" w:hAnsi="Times New Roman" w:cs="Times New Roman" w:hint="eastAsia"/>
-          <w:sz w:val="24"/>
-          <w:szCs w:val="24"/>
-        </w:rPr>
-      </w:pPr>
-      <w:r>
-        <w:rPr>
-          <w:rFonts w:ascii="Times New Roman" w:hAnsi="Times New Roman" w:cs="Times New Roman" w:hint="eastAsia"/>
-          <w:sz w:val="24"/>
-          <w:szCs w:val="24"/>
-        </w:rPr>
-        <w:t>Compare, pool /</w:t>
-      </w:r>
-      <w:r>
-        <w:rPr>
-          <w:rFonts w:ascii="Times New Roman" w:hAnsi="Times New Roman" w:cs="Times New Roman" w:hint="eastAsia"/>
-          <w:sz w:val="24"/>
-          <w:szCs w:val="24"/>
-        </w:rPr>
-        <w:t>p</w:t>
-      </w:r>
-      <w:r>
-        <w:rPr>
-          <w:rFonts w:ascii="Times New Roman" w:hAnsi="Times New Roman" w:cs="Times New Roman" w:hint="eastAsia"/>
-          <w:sz w:val="24"/>
-          <w:szCs w:val="24"/>
-        </w:rPr>
-        <w:t>u:</w:t>
-      </w:r>
-      <w:r>
-        <w:rPr>
-          <w:rFonts w:ascii="Times New Roman" w:hAnsi="Times New Roman" w:cs="Times New Roman" w:hint="eastAsia"/>
-          <w:sz w:val="24"/>
-          <w:szCs w:val="24"/>
-        </w:rPr>
-        <w:t>l</w:t>
-      </w:r>
-      <w:r>
-        <w:rPr>
-          <w:rFonts w:ascii="Times New Roman" w:hAnsi="Times New Roman" w:cs="Times New Roman" w:hint="eastAsia"/>
-          <w:sz w:val="24"/>
-          <w:szCs w:val="24"/>
-        </w:rPr>
-        <w:t>/ and pull /</w:t>
-      </w:r>
-      <w:r>
-        <w:rPr>
-          <w:rFonts w:ascii="Times New Roman" w:hAnsi="Times New Roman" w:cs="Times New Roman" w:hint="eastAsia"/>
-          <w:sz w:val="24"/>
-          <w:szCs w:val="24"/>
-        </w:rPr>
-        <w:t>p</w:t>
-      </w:r>
-      <w:r>
-        <w:rPr>
-          <w:rFonts w:ascii="Times New Roman" w:hAnsi="Times New Roman" w:cs="Times New Roman"/>
-          <w:sz w:val="24"/>
-          <w:szCs w:val="24"/>
-        </w:rPr>
-        <w:t>ʊ</w:t>
-      </w:r>
-      <w:r>
-        <w:rPr>
-          <w:rFonts w:ascii="Times New Roman" w:hAnsi="Times New Roman" w:cs="Times New Roman" w:hint="eastAsia"/>
-          <w:sz w:val="24"/>
-          <w:szCs w:val="24"/>
-        </w:rPr>
-        <w:t>l</w:t>
-      </w:r>
-      <w:r>
-        <w:rPr>
-          <w:rFonts w:ascii="Times New Roman" w:hAnsi="Times New Roman" w:cs="Times New Roman" w:hint="eastAsia"/>
-          <w:sz w:val="24"/>
-          <w:szCs w:val="24"/>
-        </w:rPr>
-        <w:t>/.</w:t>
-      </w:r>
-    </w:p>
-    <w:p>
-      <w:pPr>
-        <w:outlineLvl w:val="1"/>
-        <w:rPr>
-          <w:rFonts w:ascii="Times New Roman" w:hAnsi="Times New Roman" w:cs="Times New Roman" w:hint="eastAsia"/>
-          <w:b/>
-          <w:sz w:val="32"/>
-        </w:rPr>
-      </w:pPr>
-      <w:r>
-        <w:rPr>
-          <w:rFonts w:ascii="Times New Roman" w:hAnsi="Times New Roman" w:cs="Times New Roman" w:hint="eastAsia"/>
-          <w:b/>
-          <w:sz w:val="32"/>
-        </w:rPr>
-        <w:t>4. /e/</w:t>
-      </w:r>
-    </w:p>
-    <w:p>
-      <w:pPr>
-        <w:rPr>
-          <w:rFonts w:ascii="Times New Roman" w:hAnsi="Times New Roman" w:cs="Times New Roman"/>
-          <w:sz w:val="24"/>
-          <w:szCs w:val="24"/>
-        </w:rPr>
-      </w:pPr>
-      <w:r>
-        <w:rPr>
-          <w:rFonts w:ascii="Times New Roman" w:hAnsi="Times New Roman" w:cs="Times New Roman" w:hint="eastAsia"/>
-          <w:sz w:val="24"/>
-          <w:szCs w:val="24"/>
-        </w:rPr>
-        <w:t>/e/ is a short vowel.</w:t>
+    </w:p>
+    <w:p>
+      <w:pPr>
+        <w:rPr>
+          <w:rFonts w:ascii="Times New Roman" w:hAnsi="Times New Roman" w:cs="Times New Roman"/>
+          <w:sz w:val="24"/>
+          <w:szCs w:val="24"/>
+        </w:rPr>
+      </w:pPr>
+      <w:r>
+        <w:rPr>
+          <w:rFonts w:ascii="Times New Roman" w:hAnsi="Times New Roman" w:cs="Times New Roman" w:hint="eastAsia"/>
+          <w:sz w:val="24"/>
+          <w:szCs w:val="24"/>
+        </w:rPr>
+        <w:t>To articulate /</w:t>
+      </w:r>
+      <w:r>
+        <w:rPr>
+          <w:rFonts w:ascii="Times New Roman" w:hAnsi="Times New Roman" w:cs="Times New Roman"/>
+          <w:sz w:val="24"/>
+          <w:szCs w:val="24"/>
+        </w:rPr>
+        <w:t>ɔ</w:t>
+      </w:r>
+      <w:r>
+        <w:rPr>
+          <w:rFonts w:ascii="Times New Roman" w:hAnsi="Times New Roman" w:cs="Times New Roman" w:hint="eastAsia"/>
+          <w:sz w:val="24"/>
+          <w:szCs w:val="24"/>
+        </w:rPr>
+        <w:t xml:space="preserve">/ you should put your tongue backward and rise it high </w:t>
+      </w:r>
+      <w:r>
+        <w:rPr>
+          <w:rFonts w:ascii="Times New Roman" w:hAnsi="Times New Roman" w:cs="Times New Roman" w:hint="eastAsia"/>
+          <w:sz w:val="24"/>
+          <w:szCs w:val="24"/>
+        </w:rPr>
+        <w:t>but not too high.</w:t>
       </w:r>
     </w:p>
     <w:sectPr>
@@ -2575,4 +2946,16 @@
   <a:objectDefaults/>
   <a:extraClrSchemeLst/>
 </a:theme>
+</file>
+
+<file path=customXml/item1.xml><?xml version="1.0" encoding="utf-8"?>
+<b:Sources xmlns:b="http://schemas.openxmlformats.org/officeDocument/2006/bibliography" xmlns="http://schemas.openxmlformats.org/officeDocument/2006/bibliography" SelectedStyle="\APA.XSL" StyleName="APA"/>
+</file>
+
+<file path=customXml/itemProps1.xml><?xml version="1.0" encoding="utf-8"?>
+<ds:datastoreItem xmlns:ds="http://schemas.openxmlformats.org/officeDocument/2006/customXml" ds:itemID="{EF912387-C5C1-4514-8BA0-5E92C540112B}">
+  <ds:schemaRefs>
+    <ds:schemaRef ds:uri="http://schemas.openxmlformats.org/officeDocument/2006/bibliography"/>
+  </ds:schemaRefs>
+</ds:datastoreItem>
 </file>
</xml_diff>

<commit_message>
udpate notes of pronunciation
</commit_message>
<xml_diff>
--- a/Speaking/Pronunciation.docx
+++ b/Speaking/Pronunciation.docx
@@ -120,6 +120,25 @@
     </w:p>
     <w:p>
       <w:pPr>
+        <w:outlineLvl w:val="2"/>
+        <w:rPr>
+          <w:rFonts w:ascii="Times New Roman" w:hAnsi="Times New Roman" w:cs="Times New Roman"/>
+          <w:b/>
+          <w:sz w:val="24"/>
+        </w:rPr>
+      </w:pPr>
+      <w:r>
+        <w:rPr>
+          <w:rFonts w:ascii="Times New Roman" w:hAnsi="Times New Roman" w:cs="Times New Roman"/>
+          <w:b/>
+          <w:sz w:val="24"/>
+        </w:rPr>
+        <w:t>Hotkeys of phonetic aphabet</w:t>
+      </w:r>
+    </w:p>
+    <w:p>
+      <w:pPr>
+        <w:outlineLvl w:val="3"/>
         <w:rPr>
           <w:rFonts w:ascii="Times New Roman" w:hAnsi="Times New Roman" w:cs="Times New Roman"/>
           <w:sz w:val="24"/>
@@ -226,6 +245,7 @@
     </w:p>
     <w:p>
       <w:pPr>
+        <w:outlineLvl w:val="3"/>
         <w:rPr>
           <w:rFonts w:ascii="Times New Roman" w:hAnsi="Times New Roman" w:cs="Times New Roman"/>
           <w:sz w:val="24"/>
@@ -297,8 +317,9 @@
     </w:p>
     <w:p>
       <w:pPr>
-        <w:rPr>
-          <w:rFonts w:ascii="Times New Roman" w:hAnsi="Times New Roman" w:cs="Times New Roman" w:hint="eastAsia"/>
+        <w:outlineLvl w:val="3"/>
+        <w:rPr>
+          <w:rFonts w:ascii="Times New Roman" w:hAnsi="Times New Roman" w:cs="Times New Roman"/>
           <w:sz w:val="24"/>
           <w:lang w:val="en-US"/>
         </w:rPr>
@@ -386,8 +407,9 @@
     </w:p>
     <w:p>
       <w:pPr>
-        <w:rPr>
-          <w:rFonts w:ascii="Times New Roman" w:hAnsi="Times New Roman" w:cs="Times New Roman"/>
+        <w:outlineLvl w:val="3"/>
+        <w:rPr>
+          <w:rFonts w:ascii="Times New Roman" w:hAnsi="Times New Roman" w:cs="Times New Roman" w:hint="eastAsia"/>
           <w:sz w:val="24"/>
           <w:lang w:val="en-US"/>
         </w:rPr>
@@ -406,14 +428,22 @@
           <w:sz w:val="24"/>
           <w:lang w:val="en-US"/>
         </w:rPr>
-        <w:t xml:space="preserve"> : </w:t>
-      </w:r>
-      <w:r>
-        <w:rPr>
-          <w:rFonts w:ascii="Times New Roman" w:hAnsi="Times New Roman" w:cs="Times New Roman"/>
+        <w:t xml:space="preserve"> </w:t>
+      </w:r>
+      <w:r>
+        <w:rPr>
+          <w:rFonts w:ascii="Times New Roman" w:hAnsi="Times New Roman" w:cs="Times New Roman" w:hint="eastAsia"/>
           <w:sz w:val="24"/>
           <w:lang w:val="en-US"/>
         </w:rPr>
+        <w:t xml:space="preserve">: </w:t>
+      </w:r>
+      <w:r>
+        <w:rPr>
+          <w:rFonts w:ascii="Times New Roman" w:hAnsi="Times New Roman" w:cs="Times New Roman"/>
+          <w:sz w:val="24"/>
+          <w:lang w:val="en-US"/>
+        </w:rPr>
         <w:t>“</w:t>
       </w:r>
       <w:r>
@@ -464,6 +494,83 @@
         </w:rPr>
         <w:t>”</w:t>
       </w:r>
+    </w:p>
+    <w:p>
+      <w:pPr>
+        <w:outlineLvl w:val="3"/>
+        <w:rPr>
+          <w:rFonts w:ascii="Times New Roman" w:hAnsi="Times New Roman" w:cs="Times New Roman" w:hint="eastAsia"/>
+          <w:sz w:val="24"/>
+          <w:lang w:val="en-US"/>
+        </w:rPr>
+      </w:pPr>
+      <w:r>
+        <w:rPr>
+          <w:rFonts w:ascii="Times New Roman" w:hAnsi="Times New Roman" w:cs="Times New Roman"/>
+          <w:sz w:val="24"/>
+          <w:lang w:val="en-US"/>
+        </w:rPr>
+        <w:t>ɑ</w:t>
+      </w:r>
+      <w:r>
+        <w:rPr>
+          <w:rFonts w:ascii="Times New Roman" w:hAnsi="Times New Roman" w:cs="Times New Roman" w:hint="eastAsia"/>
+          <w:sz w:val="24"/>
+          <w:lang w:val="en-US"/>
+        </w:rPr>
+        <w:t xml:space="preserve"> </w:t>
+      </w:r>
+      <w:r>
+        <w:rPr>
+          <w:rFonts w:ascii="Times New Roman" w:hAnsi="Times New Roman" w:cs="Times New Roman"/>
+          <w:sz w:val="24"/>
+          <w:lang w:val="en-US"/>
+        </w:rPr>
+        <w:t>:</w:t>
+      </w:r>
+      <w:r>
+        <w:rPr>
+          <w:rFonts w:ascii="Times New Roman" w:hAnsi="Times New Roman" w:cs="Times New Roman" w:hint="eastAsia"/>
+          <w:sz w:val="24"/>
+          <w:lang w:val="en-US"/>
+        </w:rPr>
+        <w:t xml:space="preserve">   0251 + Alt_x</w:t>
+      </w:r>
+    </w:p>
+    <w:p>
+      <w:pPr>
+        <w:outlineLvl w:val="3"/>
+        <w:rPr>
+          <w:rFonts w:ascii="Times New Roman" w:hAnsi="Times New Roman" w:cs="Times New Roman" w:hint="eastAsia"/>
+          <w:sz w:val="24"/>
+          <w:lang w:val="en-US"/>
+        </w:rPr>
+      </w:pPr>
+      <w:r>
+        <w:rPr>
+          <w:rFonts w:ascii="Times New Roman" w:hAnsi="Times New Roman" w:cs="Times New Roman"/>
+          <w:sz w:val="24"/>
+          <w:lang w:val="en-US"/>
+        </w:rPr>
+        <w:t>ɒ</w:t>
+      </w:r>
+      <w:r>
+        <w:rPr>
+          <w:rFonts w:ascii="Times New Roman" w:hAnsi="Times New Roman" w:cs="Times New Roman" w:hint="eastAsia"/>
+          <w:sz w:val="24"/>
+          <w:lang w:val="en-US"/>
+        </w:rPr>
+        <w:t xml:space="preserve"> : 0252 + Alt_x</w:t>
+      </w:r>
+    </w:p>
+    <w:p>
+      <w:pPr>
+        <w:rPr>
+          <w:rFonts w:ascii="Times New Roman" w:hAnsi="Times New Roman" w:cs="Times New Roman" w:hint="eastAsia"/>
+          <w:sz w:val="24"/>
+          <w:lang w:val="en-US"/>
+        </w:rPr>
+      </w:pPr>
     </w:p>
     <w:p>
       <w:pPr>
@@ -544,6 +651,7 @@
         <w:rPr>
           <w:rFonts w:hint="eastAsia"/>
         </w:rPr>
+        <w:lastRenderedPageBreak/>
         <w:t xml:space="preserve">The tip of blage of your tongue is close to(but not touching) the alveolar ridge. </w:t>
       </w:r>
     </w:p>
@@ -594,7 +702,6 @@
         <w:rPr>
           <w:rFonts w:hint="eastAsia"/>
         </w:rPr>
-        <w:lastRenderedPageBreak/>
         <w:t xml:space="preserve">/z/ </w:t>
       </w:r>
     </w:p>
@@ -1991,17 +2098,18 @@
     <w:p>
       <w:pPr>
         <w:rPr>
-          <w:rFonts w:ascii="Times New Roman" w:hAnsi="Times New Roman" w:cs="Times New Roman" w:hint="eastAsia"/>
-          <w:sz w:val="24"/>
-          <w:szCs w:val="24"/>
-        </w:rPr>
-      </w:pPr>
-      <w:r>
-        <w:rPr>
-          <w:rFonts w:ascii="Times New Roman" w:hAnsi="Times New Roman" w:cs="Times New Roman" w:hint="eastAsia"/>
-          <w:sz w:val="24"/>
-          <w:szCs w:val="24"/>
-        </w:rPr>
+          <w:rFonts w:ascii="Times New Roman" w:hAnsi="Times New Roman" w:cs="Times New Roman"/>
+          <w:sz w:val="24"/>
+          <w:szCs w:val="24"/>
+        </w:rPr>
+      </w:pPr>
+      <w:r>
+        <w:rPr>
+          <w:rFonts w:ascii="Times New Roman" w:hAnsi="Times New Roman" w:cs="Times New Roman" w:hint="eastAsia"/>
+          <w:sz w:val="24"/>
+          <w:szCs w:val="24"/>
+        </w:rPr>
+        <w:lastRenderedPageBreak/>
         <w:t>/e/ is a short vowel.</w:t>
       </w:r>
       <w:r>
@@ -2093,8 +2201,6 @@
         </w:rPr>
         <w:t>.</w:t>
       </w:r>
-      <w:bookmarkStart w:id="0" w:name="_GoBack"/>
-      <w:bookmarkEnd w:id="0"/>
     </w:p>
     <w:p>
       <w:pPr>
@@ -2144,7 +2250,6 @@
           <w:sz w:val="24"/>
           <w:szCs w:val="24"/>
         </w:rPr>
-        <w:lastRenderedPageBreak/>
         <w:t>When you articulate /</w:t>
       </w:r>
       <w:r>
@@ -2232,11 +2337,11 @@
       </w:r>
       <w:r>
         <w:rPr>
-          <w:rFonts w:ascii="Times New Roman" w:hAnsi="Times New Roman" w:cs="Times New Roman" w:hint="eastAsia"/>
+          <w:rFonts w:ascii="Arial" w:hAnsi="Arial" w:cs="Arial" w:hint="eastAsia"/>
           <w:b/>
           <w:sz w:val="32"/>
         </w:rPr>
-        <w:t>/</w:t>
+        <w:t>:</w:t>
       </w:r>
       <w:r>
         <w:rPr>
@@ -2244,13 +2349,21 @@
           <w:b/>
           <w:sz w:val="32"/>
         </w:rPr>
+        <w:t>/</w:t>
+      </w:r>
+      <w:r>
+        <w:rPr>
+          <w:rFonts w:ascii="Times New Roman" w:hAnsi="Times New Roman" w:cs="Times New Roman" w:hint="eastAsia"/>
+          <w:b/>
+          <w:sz w:val="32"/>
+        </w:rPr>
         <w:t xml:space="preserve">  </w:t>
       </w:r>
     </w:p>
     <w:p>
       <w:pPr>
         <w:rPr>
-          <w:rFonts w:ascii="Times New Roman" w:hAnsi="Times New Roman" w:cs="Times New Roman"/>
+          <w:rFonts w:ascii="Times New Roman" w:hAnsi="Times New Roman" w:cs="Times New Roman" w:hint="eastAsia"/>
           <w:sz w:val="24"/>
           <w:szCs w:val="24"/>
         </w:rPr>
@@ -2277,6 +2390,14 @@
           <w:sz w:val="24"/>
           <w:szCs w:val="24"/>
         </w:rPr>
+        <w:t>:</w:t>
+      </w:r>
+      <w:r>
+        <w:rPr>
+          <w:rFonts w:ascii="Times New Roman" w:hAnsi="Times New Roman" w:cs="Times New Roman" w:hint="eastAsia"/>
+          <w:sz w:val="24"/>
+          <w:szCs w:val="24"/>
+        </w:rPr>
         <w:t xml:space="preserve">/ you should put your tongue backward and rise it high </w:t>
       </w:r>
       <w:r>
@@ -2287,6 +2408,403 @@
         </w:rPr>
         <w:t>but not too high.</w:t>
       </w:r>
+    </w:p>
+    <w:p>
+      <w:pPr>
+        <w:outlineLvl w:val="1"/>
+        <w:rPr>
+          <w:rFonts w:ascii="Times New Roman" w:hAnsi="Times New Roman" w:cs="Times New Roman" w:hint="eastAsia"/>
+          <w:b/>
+          <w:sz w:val="32"/>
+        </w:rPr>
+      </w:pPr>
+      <w:r>
+        <w:rPr>
+          <w:rFonts w:ascii="Times New Roman" w:hAnsi="Times New Roman" w:cs="Times New Roman" w:hint="eastAsia"/>
+          <w:b/>
+          <w:sz w:val="32"/>
+        </w:rPr>
+        <w:t>7 /</w:t>
+      </w:r>
+      <w:r>
+        <w:rPr>
+          <w:rFonts w:ascii="Times New Roman" w:hAnsi="Times New Roman" w:cs="Times New Roman"/>
+          <w:b/>
+          <w:sz w:val="32"/>
+        </w:rPr>
+        <w:t>ɑ</w:t>
+      </w:r>
+      <w:r>
+        <w:rPr>
+          <w:rFonts w:ascii="Times New Roman" w:hAnsi="Times New Roman" w:cs="Times New Roman" w:hint="eastAsia"/>
+          <w:b/>
+          <w:sz w:val="32"/>
+        </w:rPr>
+        <w:t>:</w:t>
+      </w:r>
+      <w:r>
+        <w:rPr>
+          <w:rFonts w:ascii="Times New Roman" w:hAnsi="Times New Roman" w:cs="Times New Roman" w:hint="eastAsia"/>
+          <w:b/>
+          <w:sz w:val="32"/>
+        </w:rPr>
+        <w:t>/</w:t>
+      </w:r>
+    </w:p>
+    <w:p>
+      <w:pPr>
+        <w:rPr>
+          <w:rFonts w:ascii="Times New Roman" w:hAnsi="Times New Roman" w:cs="Times New Roman" w:hint="eastAsia"/>
+          <w:sz w:val="24"/>
+          <w:szCs w:val="24"/>
+        </w:rPr>
+      </w:pPr>
+      <w:r>
+        <w:rPr>
+          <w:rFonts w:ascii="Times New Roman" w:hAnsi="Times New Roman" w:cs="Times New Roman" w:hint="eastAsia"/>
+          <w:sz w:val="24"/>
+          <w:szCs w:val="24"/>
+        </w:rPr>
+        <w:t xml:space="preserve">It is actually the Latin </w:t>
+      </w:r>
+      <w:r>
+        <w:rPr>
+          <w:rFonts w:ascii="Times New Roman" w:hAnsi="Times New Roman" w:cs="Times New Roman"/>
+          <w:sz w:val="24"/>
+          <w:szCs w:val="24"/>
+        </w:rPr>
+        <w:t>α</w:t>
+      </w:r>
+      <w:r>
+        <w:rPr>
+          <w:rFonts w:ascii="Times New Roman" w:hAnsi="Times New Roman" w:cs="Times New Roman" w:hint="eastAsia"/>
+          <w:sz w:val="24"/>
+          <w:szCs w:val="24"/>
+        </w:rPr>
+        <w:t xml:space="preserve"> (alpha). </w:t>
+      </w:r>
+      <w:r>
+        <w:rPr>
+          <w:rFonts w:ascii="Times New Roman" w:hAnsi="Times New Roman" w:cs="Times New Roman" w:hint="eastAsia"/>
+          <w:sz w:val="24"/>
+          <w:szCs w:val="24"/>
+        </w:rPr>
+        <w:t>Your</w:t>
+      </w:r>
+      <w:r>
+        <w:rPr>
+          <w:rFonts w:ascii="Times New Roman" w:hAnsi="Times New Roman" w:cs="Times New Roman" w:hint="eastAsia"/>
+          <w:sz w:val="24"/>
+          <w:szCs w:val="24"/>
+        </w:rPr>
+        <w:t xml:space="preserve"> tongue is more backward than when you articulate </w:t>
+      </w:r>
+      <w:r>
+        <w:rPr>
+          <w:rFonts w:ascii="Times New Roman" w:hAnsi="Times New Roman" w:cs="Times New Roman"/>
+          <w:sz w:val="24"/>
+          <w:szCs w:val="24"/>
+        </w:rPr>
+        <w:t>t</w:t>
+      </w:r>
+      <w:r>
+        <w:rPr>
+          <w:rFonts w:ascii="Times New Roman" w:hAnsi="Times New Roman" w:cs="Times New Roman" w:hint="eastAsia"/>
+          <w:sz w:val="24"/>
+          <w:szCs w:val="24"/>
+        </w:rPr>
+        <w:t xml:space="preserve">he Chinese </w:t>
+      </w:r>
+      <w:r>
+        <w:rPr>
+          <w:rFonts w:ascii="Times New Roman" w:hAnsi="Times New Roman" w:cs="Times New Roman"/>
+          <w:sz w:val="24"/>
+          <w:szCs w:val="24"/>
+        </w:rPr>
+        <w:t>“</w:t>
+      </w:r>
+      <w:r>
+        <w:rPr>
+          <w:rFonts w:ascii="Times New Roman" w:hAnsi="Times New Roman" w:cs="Times New Roman" w:hint="eastAsia"/>
+          <w:sz w:val="24"/>
+          <w:szCs w:val="24"/>
+        </w:rPr>
+        <w:t>a</w:t>
+      </w:r>
+      <w:r>
+        <w:rPr>
+          <w:rFonts w:ascii="Times New Roman" w:hAnsi="Times New Roman" w:cs="Times New Roman"/>
+          <w:sz w:val="24"/>
+          <w:szCs w:val="24"/>
+        </w:rPr>
+        <w:t>”</w:t>
+      </w:r>
+      <w:r>
+        <w:rPr>
+          <w:rFonts w:ascii="Times New Roman" w:hAnsi="Times New Roman" w:cs="Times New Roman" w:hint="eastAsia"/>
+          <w:sz w:val="24"/>
+          <w:szCs w:val="24"/>
+        </w:rPr>
+        <w:t xml:space="preserve">. </w:t>
+      </w:r>
+    </w:p>
+    <w:p>
+      <w:pPr>
+        <w:rPr>
+          <w:rFonts w:ascii="Times New Roman" w:hAnsi="Times New Roman" w:cs="Times New Roman" w:hint="eastAsia"/>
+          <w:sz w:val="24"/>
+          <w:szCs w:val="24"/>
+        </w:rPr>
+      </w:pPr>
+      <w:r>
+        <w:rPr>
+          <w:rFonts w:ascii="Times New Roman" w:hAnsi="Times New Roman" w:cs="Times New Roman" w:hint="eastAsia"/>
+          <w:sz w:val="24"/>
+          <w:szCs w:val="24"/>
+        </w:rPr>
+        <w:t>car /</w:t>
+      </w:r>
+      <w:r>
+        <w:rPr>
+          <w:rFonts w:ascii="Times New Roman" w:hAnsi="Times New Roman" w:cs="Times New Roman"/>
+          <w:sz w:val="24"/>
+          <w:szCs w:val="24"/>
+        </w:rPr>
+        <w:t>kɑ:</w:t>
+      </w:r>
+      <w:r>
+        <w:rPr>
+          <w:rFonts w:ascii="Times New Roman" w:hAnsi="Times New Roman" w:cs="Times New Roman" w:hint="eastAsia"/>
+          <w:sz w:val="24"/>
+          <w:szCs w:val="24"/>
+        </w:rPr>
+        <w:t>/</w:t>
+      </w:r>
+    </w:p>
+    <w:p>
+      <w:pPr>
+        <w:rPr>
+          <w:rFonts w:ascii="Times New Roman" w:hAnsi="Times New Roman" w:cs="Times New Roman" w:hint="eastAsia"/>
+          <w:sz w:val="24"/>
+          <w:szCs w:val="24"/>
+        </w:rPr>
+      </w:pPr>
+      <w:r>
+        <w:rPr>
+          <w:rFonts w:ascii="Times New Roman" w:hAnsi="Times New Roman" w:cs="Times New Roman" w:hint="eastAsia"/>
+          <w:sz w:val="24"/>
+          <w:szCs w:val="24"/>
+        </w:rPr>
+        <w:t>8</w:t>
+      </w:r>
+      <w:r>
+        <w:rPr>
+          <w:rFonts w:ascii="Times New Roman" w:hAnsi="Times New Roman" w:cs="Times New Roman" w:hint="eastAsia"/>
+          <w:sz w:val="24"/>
+          <w:szCs w:val="24"/>
+        </w:rPr>
+        <w:t xml:space="preserve"> /</w:t>
+      </w:r>
+      <w:r>
+        <w:rPr>
+          <w:rFonts w:ascii="Times New Roman" w:hAnsi="Times New Roman" w:cs="Times New Roman"/>
+          <w:sz w:val="24"/>
+          <w:szCs w:val="24"/>
+        </w:rPr>
+        <w:t>ɒ</w:t>
+      </w:r>
+      <w:r>
+        <w:rPr>
+          <w:rFonts w:ascii="Times New Roman" w:hAnsi="Times New Roman" w:cs="Times New Roman" w:hint="eastAsia"/>
+          <w:sz w:val="24"/>
+          <w:szCs w:val="24"/>
+        </w:rPr>
+        <w:t>/</w:t>
+      </w:r>
+    </w:p>
+    <w:p>
+      <w:pPr>
+        <w:rPr>
+          <w:rFonts w:ascii="Times New Roman" w:hAnsi="Times New Roman" w:cs="Times New Roman" w:hint="eastAsia"/>
+          <w:sz w:val="24"/>
+          <w:szCs w:val="24"/>
+        </w:rPr>
+      </w:pPr>
+      <w:r>
+        <w:rPr>
+          <w:rFonts w:ascii="Times New Roman" w:hAnsi="Times New Roman" w:cs="Times New Roman"/>
+          <w:sz w:val="24"/>
+          <w:szCs w:val="24"/>
+        </w:rPr>
+        <w:t>ɒ is the ɑ</w:t>
+      </w:r>
+      <w:r>
+        <w:rPr>
+          <w:rFonts w:ascii="Times New Roman" w:hAnsi="Times New Roman" w:cs="Times New Roman" w:hint="eastAsia"/>
+          <w:sz w:val="24"/>
+          <w:szCs w:val="24"/>
+        </w:rPr>
+        <w:t xml:space="preserve"> rotated by 180 degrees. </w:t>
+      </w:r>
+    </w:p>
+    <w:p>
+      <w:pPr>
+        <w:rPr>
+          <w:rFonts w:ascii="Times New Roman" w:hAnsi="Times New Roman" w:cs="Times New Roman" w:hint="eastAsia"/>
+          <w:sz w:val="24"/>
+          <w:szCs w:val="24"/>
+        </w:rPr>
+      </w:pPr>
+      <w:r>
+        <w:rPr>
+          <w:rFonts w:ascii="Times New Roman" w:hAnsi="Times New Roman" w:cs="Times New Roman" w:hint="eastAsia"/>
+          <w:sz w:val="24"/>
+          <w:szCs w:val="24"/>
+        </w:rPr>
+        <w:t xml:space="preserve">Your tongue is more backward than when you pronounce the Chinse </w:t>
+      </w:r>
+      <w:r>
+        <w:rPr>
+          <w:rFonts w:ascii="Times New Roman" w:hAnsi="Times New Roman" w:cs="Times New Roman"/>
+          <w:sz w:val="24"/>
+          <w:szCs w:val="24"/>
+        </w:rPr>
+        <w:t>“</w:t>
+      </w:r>
+      <w:r>
+        <w:rPr>
+          <w:rFonts w:ascii="Times New Roman" w:hAnsi="Times New Roman" w:cs="Times New Roman" w:hint="eastAsia"/>
+          <w:sz w:val="24"/>
+          <w:szCs w:val="24"/>
+        </w:rPr>
+        <w:t>o</w:t>
+      </w:r>
+      <w:r>
+        <w:rPr>
+          <w:rFonts w:ascii="Times New Roman" w:hAnsi="Times New Roman" w:cs="Times New Roman"/>
+          <w:sz w:val="24"/>
+          <w:szCs w:val="24"/>
+        </w:rPr>
+        <w:t>”</w:t>
+      </w:r>
+      <w:r>
+        <w:rPr>
+          <w:rFonts w:ascii="Times New Roman" w:hAnsi="Times New Roman" w:cs="Times New Roman" w:hint="eastAsia"/>
+          <w:sz w:val="24"/>
+          <w:szCs w:val="24"/>
+        </w:rPr>
+        <w:t>.</w:t>
+      </w:r>
+      <w:r>
+        <w:rPr>
+          <w:rFonts w:ascii="Times New Roman" w:hAnsi="Times New Roman" w:cs="Times New Roman" w:hint="eastAsia"/>
+          <w:sz w:val="24"/>
+          <w:szCs w:val="24"/>
+        </w:rPr>
+        <w:t xml:space="preserve"> </w:t>
+      </w:r>
+    </w:p>
+    <w:p>
+      <w:pPr>
+        <w:rPr>
+          <w:rFonts w:ascii="Times New Roman" w:hAnsi="Times New Roman" w:cs="Times New Roman" w:hint="eastAsia"/>
+          <w:sz w:val="24"/>
+          <w:szCs w:val="24"/>
+        </w:rPr>
+      </w:pPr>
+      <w:r>
+        <w:rPr>
+          <w:rFonts w:ascii="Times New Roman" w:hAnsi="Times New Roman" w:cs="Times New Roman" w:hint="eastAsia"/>
+          <w:sz w:val="24"/>
+          <w:szCs w:val="24"/>
+        </w:rPr>
+        <w:t>Note that it is not the short version of /</w:t>
+      </w:r>
+      <w:r>
+        <w:rPr>
+          <w:rFonts w:ascii="Times New Roman" w:hAnsi="Times New Roman" w:cs="Times New Roman"/>
+          <w:sz w:val="24"/>
+          <w:szCs w:val="24"/>
+        </w:rPr>
+        <w:t>ɔ</w:t>
+      </w:r>
+      <w:r>
+        <w:rPr>
+          <w:rFonts w:ascii="Times New Roman" w:hAnsi="Times New Roman" w:cs="Times New Roman" w:hint="eastAsia"/>
+          <w:sz w:val="24"/>
+          <w:szCs w:val="24"/>
+        </w:rPr>
+        <w:t>:/</w:t>
+      </w:r>
+      <w:r>
+        <w:rPr>
+          <w:rFonts w:ascii="Times New Roman" w:hAnsi="Times New Roman" w:cs="Times New Roman" w:hint="eastAsia"/>
+          <w:sz w:val="24"/>
+          <w:szCs w:val="24"/>
+        </w:rPr>
+        <w:t>.</w:t>
+      </w:r>
+      <w:r>
+        <w:rPr>
+          <w:rFonts w:ascii="Times New Roman" w:hAnsi="Times New Roman" w:cs="Times New Roman" w:hint="eastAsia"/>
+          <w:sz w:val="24"/>
+          <w:szCs w:val="24"/>
+        </w:rPr>
+        <w:t xml:space="preserve"> Your tongue is lower than /</w:t>
+      </w:r>
+      <w:r>
+        <w:rPr>
+          <w:rFonts w:ascii="Times New Roman" w:hAnsi="Times New Roman" w:cs="Times New Roman"/>
+          <w:sz w:val="24"/>
+          <w:szCs w:val="24"/>
+        </w:rPr>
+        <w:t>ɔ</w:t>
+      </w:r>
+      <w:r>
+        <w:rPr>
+          <w:rFonts w:ascii="Times New Roman" w:hAnsi="Times New Roman" w:cs="Times New Roman" w:hint="eastAsia"/>
+          <w:sz w:val="24"/>
+          <w:szCs w:val="24"/>
+        </w:rPr>
+        <w:t>:/</w:t>
+      </w:r>
+      <w:r>
+        <w:rPr>
+          <w:rFonts w:ascii="Times New Roman" w:hAnsi="Times New Roman" w:cs="Times New Roman" w:hint="eastAsia"/>
+          <w:sz w:val="24"/>
+          <w:szCs w:val="24"/>
+        </w:rPr>
+        <w:t>.</w:t>
+      </w:r>
+    </w:p>
+    <w:p>
+      <w:pPr>
+        <w:rPr>
+          <w:rFonts w:ascii="Times New Roman" w:hAnsi="Times New Roman" w:cs="Times New Roman"/>
+          <w:sz w:val="24"/>
+          <w:szCs w:val="24"/>
+        </w:rPr>
+      </w:pPr>
+      <w:bookmarkStart w:id="0" w:name="_GoBack"/>
+      <w:bookmarkEnd w:id="0"/>
+    </w:p>
+    <w:p>
+      <w:pPr>
+        <w:rPr>
+          <w:rFonts w:ascii="Times New Roman" w:hAnsi="Times New Roman" w:cs="Times New Roman" w:hint="eastAsia"/>
+          <w:sz w:val="24"/>
+          <w:szCs w:val="24"/>
+        </w:rPr>
+      </w:pPr>
+    </w:p>
+    <w:p>
+      <w:pPr>
+        <w:rPr>
+          <w:rFonts w:ascii="Times New Roman" w:hAnsi="Times New Roman" w:cs="Times New Roman"/>
+          <w:sz w:val="24"/>
+          <w:szCs w:val="24"/>
+        </w:rPr>
+      </w:pPr>
     </w:p>
     <w:sectPr>
       <w:pgSz w:w="11906" w:h="16838"/>
@@ -3285,7 +3803,7 @@
 </file>
 
 <file path=customXml/itemProps1.xml><?xml version="1.0" encoding="utf-8"?>
-<ds:datastoreItem xmlns:ds="http://schemas.openxmlformats.org/officeDocument/2006/customXml" ds:itemID="{6A7FE7E1-01BA-4A56-A5CD-C21233033179}">
+<ds:datastoreItem xmlns:ds="http://schemas.openxmlformats.org/officeDocument/2006/customXml" ds:itemID="{642AFC57-CFC0-4156-9D03-E312F5A7EBBB}">
   <ds:schemaRefs>
     <ds:schemaRef ds:uri="http://schemas.openxmlformats.org/officeDocument/2006/bibliography"/>
   </ds:schemaRefs>

</xml_diff>

<commit_message>
update notes of pronunciation"
</commit_message>
<xml_diff>
--- a/Speaking/Pronunciation.docx
+++ b/Speaking/Pronunciation.docx
@@ -409,7 +409,7 @@
       <w:pPr>
         <w:outlineLvl w:val="3"/>
         <w:rPr>
-          <w:rFonts w:ascii="Times New Roman" w:hAnsi="Times New Roman" w:cs="Times New Roman" w:hint="eastAsia"/>
+          <w:rFonts w:ascii="Times New Roman" w:hAnsi="Times New Roman" w:cs="Times New Roman"/>
           <w:sz w:val="24"/>
           <w:lang w:val="en-US"/>
         </w:rPr>
@@ -499,7 +499,7 @@
       <w:pPr>
         <w:outlineLvl w:val="3"/>
         <w:rPr>
-          <w:rFonts w:ascii="Times New Roman" w:hAnsi="Times New Roman" w:cs="Times New Roman" w:hint="eastAsia"/>
+          <w:rFonts w:ascii="Times New Roman" w:hAnsi="Times New Roman" w:cs="Times New Roman"/>
           <w:sz w:val="24"/>
           <w:lang w:val="en-US"/>
         </w:rPr>
@@ -541,7 +541,7 @@
       <w:pPr>
         <w:outlineLvl w:val="3"/>
         <w:rPr>
-          <w:rFonts w:ascii="Times New Roman" w:hAnsi="Times New Roman" w:cs="Times New Roman" w:hint="eastAsia"/>
+          <w:rFonts w:ascii="Times New Roman" w:hAnsi="Times New Roman" w:cs="Times New Roman"/>
           <w:sz w:val="24"/>
           <w:lang w:val="en-US"/>
         </w:rPr>
@@ -566,7 +566,7 @@
     <w:p>
       <w:pPr>
         <w:rPr>
-          <w:rFonts w:ascii="Times New Roman" w:hAnsi="Times New Roman" w:cs="Times New Roman" w:hint="eastAsia"/>
+          <w:rFonts w:ascii="Times New Roman" w:hAnsi="Times New Roman" w:cs="Times New Roman"/>
           <w:sz w:val="24"/>
           <w:lang w:val="en-US"/>
         </w:rPr>
@@ -2408,12 +2408,253 @@
         </w:rPr>
         <w:t>but not too high.</w:t>
       </w:r>
+      <w:r>
+        <w:rPr>
+          <w:rFonts w:ascii="Times New Roman" w:hAnsi="Times New Roman" w:cs="Times New Roman" w:hint="eastAsia"/>
+          <w:sz w:val="24"/>
+          <w:szCs w:val="24"/>
+        </w:rPr>
+        <w:t xml:space="preserve"> </w:t>
+      </w:r>
+      <w:r>
+        <w:rPr>
+          <w:rFonts w:ascii="Times New Roman" w:hAnsi="Times New Roman" w:cs="Times New Roman" w:hint="eastAsia"/>
+          <w:sz w:val="24"/>
+          <w:szCs w:val="24"/>
+        </w:rPr>
+        <w:t>Its short vowel is /</w:t>
+      </w:r>
+      <w:r>
+        <w:rPr>
+          <w:rFonts w:ascii="Times New Roman" w:hAnsi="Times New Roman" w:cs="Times New Roman"/>
+          <w:sz w:val="24"/>
+          <w:szCs w:val="24"/>
+        </w:rPr>
+        <w:t>ɔ</w:t>
+      </w:r>
+      <w:r>
+        <w:rPr>
+          <w:rFonts w:ascii="Times New Roman" w:hAnsi="Times New Roman" w:cs="Times New Roman" w:hint="eastAsia"/>
+          <w:sz w:val="24"/>
+          <w:szCs w:val="24"/>
+        </w:rPr>
+        <w:t>/, but NOT /</w:t>
+      </w:r>
+      <w:r>
+        <w:rPr>
+          <w:rFonts w:ascii="Times New Roman" w:hAnsi="Times New Roman" w:cs="Times New Roman"/>
+          <w:sz w:val="24"/>
+          <w:szCs w:val="24"/>
+        </w:rPr>
+        <w:t>ɒ</w:t>
+      </w:r>
+      <w:r>
+        <w:rPr>
+          <w:rFonts w:ascii="Times New Roman" w:hAnsi="Times New Roman" w:cs="Times New Roman" w:hint="eastAsia"/>
+          <w:sz w:val="24"/>
+          <w:szCs w:val="24"/>
+        </w:rPr>
+        <w:t xml:space="preserve">/. </w:t>
+      </w:r>
+      <w:r>
+        <w:rPr>
+          <w:rFonts w:ascii="Times New Roman" w:hAnsi="Times New Roman" w:cs="Times New Roman" w:hint="eastAsia"/>
+          <w:sz w:val="24"/>
+          <w:szCs w:val="24"/>
+        </w:rPr>
+        <w:t>It is higher than when you articulate  /</w:t>
+      </w:r>
+      <w:r>
+        <w:rPr>
+          <w:rFonts w:ascii="Times New Roman" w:hAnsi="Times New Roman" w:cs="Times New Roman"/>
+          <w:sz w:val="24"/>
+          <w:szCs w:val="24"/>
+        </w:rPr>
+        <w:t>ɒ</w:t>
+      </w:r>
+      <w:r>
+        <w:rPr>
+          <w:rFonts w:ascii="Times New Roman" w:hAnsi="Times New Roman" w:cs="Times New Roman" w:hint="eastAsia"/>
+          <w:sz w:val="24"/>
+          <w:szCs w:val="24"/>
+        </w:rPr>
+        <w:t>/</w:t>
+      </w:r>
+      <w:r>
+        <w:rPr>
+          <w:rFonts w:ascii="Times New Roman" w:hAnsi="Times New Roman" w:cs="Times New Roman" w:hint="eastAsia"/>
+          <w:sz w:val="24"/>
+          <w:szCs w:val="24"/>
+        </w:rPr>
+        <w:t>.</w:t>
+      </w:r>
+    </w:p>
+    <w:p>
+      <w:pPr>
+        <w:rPr>
+          <w:rFonts w:ascii="Times New Roman" w:hAnsi="Times New Roman" w:cs="Times New Roman"/>
+          <w:sz w:val="24"/>
+          <w:szCs w:val="24"/>
+        </w:rPr>
+      </w:pPr>
+      <w:r>
+        <w:rPr>
+          <w:rFonts w:ascii="Times New Roman" w:hAnsi="Times New Roman" w:cs="Times New Roman" w:hint="eastAsia"/>
+          <w:sz w:val="24"/>
+          <w:szCs w:val="24"/>
+        </w:rPr>
+        <w:t xml:space="preserve">For instance, </w:t>
+      </w:r>
+      <w:r>
+        <w:rPr>
+          <w:rFonts w:ascii="Times New Roman" w:hAnsi="Times New Roman" w:cs="Times New Roman" w:hint="eastAsia"/>
+          <w:sz w:val="24"/>
+          <w:szCs w:val="24"/>
+        </w:rPr>
+        <w:t>caught /k</w:t>
+      </w:r>
+      <w:r>
+        <w:rPr>
+          <w:rFonts w:ascii="Times New Roman" w:hAnsi="Times New Roman" w:cs="Times New Roman"/>
+          <w:sz w:val="24"/>
+          <w:szCs w:val="24"/>
+        </w:rPr>
+        <w:t>ɔ</w:t>
+      </w:r>
+      <w:r>
+        <w:rPr>
+          <w:rFonts w:ascii="Times New Roman" w:hAnsi="Times New Roman" w:cs="Times New Roman" w:hint="eastAsia"/>
+          <w:sz w:val="24"/>
+          <w:szCs w:val="24"/>
+        </w:rPr>
+        <w:t>:/, bought</w:t>
+      </w:r>
+      <w:r>
+        <w:rPr>
+          <w:rFonts w:ascii="Times New Roman" w:hAnsi="Times New Roman" w:cs="Times New Roman" w:hint="eastAsia"/>
+          <w:sz w:val="24"/>
+          <w:szCs w:val="24"/>
+        </w:rPr>
+        <w:t xml:space="preserve"> /b</w:t>
+      </w:r>
+      <w:r>
+        <w:rPr>
+          <w:rFonts w:ascii="Times New Roman" w:hAnsi="Times New Roman" w:cs="Times New Roman"/>
+          <w:sz w:val="24"/>
+          <w:szCs w:val="24"/>
+        </w:rPr>
+        <w:t>ɔ</w:t>
+      </w:r>
+      <w:r>
+        <w:rPr>
+          <w:rFonts w:ascii="Times New Roman" w:hAnsi="Times New Roman" w:cs="Times New Roman" w:hint="eastAsia"/>
+          <w:sz w:val="24"/>
+          <w:szCs w:val="24"/>
+        </w:rPr>
+        <w:t>:/</w:t>
+      </w:r>
+      <w:r>
+        <w:rPr>
+          <w:rFonts w:ascii="Times New Roman" w:hAnsi="Times New Roman" w:cs="Times New Roman" w:hint="eastAsia"/>
+          <w:sz w:val="24"/>
+          <w:szCs w:val="24"/>
+        </w:rPr>
+        <w:t>, law</w:t>
+      </w:r>
+      <w:r>
+        <w:rPr>
+          <w:rFonts w:ascii="Times New Roman" w:hAnsi="Times New Roman" w:cs="Times New Roman" w:hint="eastAsia"/>
+          <w:sz w:val="24"/>
+          <w:szCs w:val="24"/>
+        </w:rPr>
+        <w:t xml:space="preserve"> /l</w:t>
+      </w:r>
+      <w:r>
+        <w:rPr>
+          <w:rFonts w:ascii="Times New Roman" w:hAnsi="Times New Roman" w:cs="Times New Roman"/>
+          <w:sz w:val="24"/>
+          <w:szCs w:val="24"/>
+        </w:rPr>
+        <w:t>ɔ</w:t>
+      </w:r>
+      <w:r>
+        <w:rPr>
+          <w:rFonts w:ascii="Times New Roman" w:hAnsi="Times New Roman" w:cs="Times New Roman" w:hint="eastAsia"/>
+          <w:sz w:val="24"/>
+          <w:szCs w:val="24"/>
+        </w:rPr>
+        <w:t>:/</w:t>
+      </w:r>
+      <w:r>
+        <w:rPr>
+          <w:rFonts w:ascii="Times New Roman" w:hAnsi="Times New Roman" w:cs="Times New Roman" w:hint="eastAsia"/>
+          <w:sz w:val="24"/>
+          <w:szCs w:val="24"/>
+        </w:rPr>
+        <w:t>, saw</w:t>
+      </w:r>
+      <w:r>
+        <w:rPr>
+          <w:rFonts w:ascii="Times New Roman" w:hAnsi="Times New Roman" w:cs="Times New Roman" w:hint="eastAsia"/>
+          <w:sz w:val="24"/>
+          <w:szCs w:val="24"/>
+        </w:rPr>
+        <w:t xml:space="preserve"> /s</w:t>
+      </w:r>
+      <w:r>
+        <w:rPr>
+          <w:rFonts w:ascii="Times New Roman" w:hAnsi="Times New Roman" w:cs="Times New Roman"/>
+          <w:sz w:val="24"/>
+          <w:szCs w:val="24"/>
+        </w:rPr>
+        <w:t>ɔ</w:t>
+      </w:r>
+      <w:r>
+        <w:rPr>
+          <w:rFonts w:ascii="Times New Roman" w:hAnsi="Times New Roman" w:cs="Times New Roman" w:hint="eastAsia"/>
+          <w:sz w:val="24"/>
+          <w:szCs w:val="24"/>
+        </w:rPr>
+        <w:t>:/</w:t>
+      </w:r>
+      <w:r>
+        <w:rPr>
+          <w:rFonts w:ascii="Times New Roman" w:hAnsi="Times New Roman" w:cs="Times New Roman" w:hint="eastAsia"/>
+          <w:sz w:val="24"/>
+          <w:szCs w:val="24"/>
+        </w:rPr>
+        <w:t>, door</w:t>
+      </w:r>
+      <w:r>
+        <w:rPr>
+          <w:rFonts w:ascii="Times New Roman" w:hAnsi="Times New Roman" w:cs="Times New Roman" w:hint="eastAsia"/>
+          <w:sz w:val="24"/>
+          <w:szCs w:val="24"/>
+        </w:rPr>
+        <w:t xml:space="preserve"> /</w:t>
+      </w:r>
+      <w:r>
+        <w:rPr>
+          <w:rFonts w:ascii="Times New Roman" w:hAnsi="Times New Roman" w:cs="Times New Roman"/>
+          <w:sz w:val="24"/>
+          <w:szCs w:val="24"/>
+        </w:rPr>
+        <w:t>ɔ</w:t>
+      </w:r>
+      <w:r>
+        <w:rPr>
+          <w:rFonts w:ascii="Times New Roman" w:hAnsi="Times New Roman" w:cs="Times New Roman" w:hint="eastAsia"/>
+          <w:sz w:val="24"/>
+          <w:szCs w:val="24"/>
+        </w:rPr>
+        <w:t>:/</w:t>
+      </w:r>
     </w:p>
     <w:p>
       <w:pPr>
         <w:outlineLvl w:val="1"/>
         <w:rPr>
-          <w:rFonts w:ascii="Times New Roman" w:hAnsi="Times New Roman" w:cs="Times New Roman" w:hint="eastAsia"/>
+          <w:rFonts w:ascii="Times New Roman" w:hAnsi="Times New Roman" w:cs="Times New Roman"/>
           <w:b/>
           <w:sz w:val="32"/>
         </w:rPr>
@@ -2454,7 +2695,7 @@
     <w:p>
       <w:pPr>
         <w:rPr>
-          <w:rFonts w:ascii="Times New Roman" w:hAnsi="Times New Roman" w:cs="Times New Roman" w:hint="eastAsia"/>
+          <w:rFonts w:ascii="Times New Roman" w:hAnsi="Times New Roman" w:cs="Times New Roman"/>
           <w:sz w:val="24"/>
           <w:szCs w:val="24"/>
         </w:rPr>
@@ -2551,7 +2792,7 @@
     <w:p>
       <w:pPr>
         <w:rPr>
-          <w:rFonts w:ascii="Times New Roman" w:hAnsi="Times New Roman" w:cs="Times New Roman" w:hint="eastAsia"/>
+          <w:rFonts w:ascii="Times New Roman" w:hAnsi="Times New Roman" w:cs="Times New Roman"/>
           <w:sz w:val="24"/>
           <w:szCs w:val="24"/>
         </w:rPr>
@@ -2583,41 +2824,42 @@
     </w:p>
     <w:p>
       <w:pPr>
-        <w:rPr>
-          <w:rFonts w:ascii="Times New Roman" w:hAnsi="Times New Roman" w:cs="Times New Roman" w:hint="eastAsia"/>
-          <w:sz w:val="24"/>
-          <w:szCs w:val="24"/>
-        </w:rPr>
-      </w:pPr>
-      <w:r>
-        <w:rPr>
-          <w:rFonts w:ascii="Times New Roman" w:hAnsi="Times New Roman" w:cs="Times New Roman" w:hint="eastAsia"/>
-          <w:sz w:val="24"/>
-          <w:szCs w:val="24"/>
+        <w:outlineLvl w:val="1"/>
+        <w:rPr>
+          <w:rFonts w:ascii="Times New Roman" w:hAnsi="Times New Roman" w:cs="Times New Roman"/>
+          <w:b/>
+          <w:sz w:val="32"/>
+        </w:rPr>
+      </w:pPr>
+      <w:r>
+        <w:rPr>
+          <w:rFonts w:ascii="Times New Roman" w:hAnsi="Times New Roman" w:cs="Times New Roman" w:hint="eastAsia"/>
+          <w:b/>
+          <w:sz w:val="32"/>
         </w:rPr>
         <w:t>8</w:t>
       </w:r>
       <w:r>
         <w:rPr>
           <w:rFonts w:ascii="Times New Roman" w:hAnsi="Times New Roman" w:cs="Times New Roman" w:hint="eastAsia"/>
-          <w:sz w:val="24"/>
-          <w:szCs w:val="24"/>
+          <w:b/>
+          <w:sz w:val="32"/>
         </w:rPr>
         <w:t xml:space="preserve"> /</w:t>
       </w:r>
       <w:r>
         <w:rPr>
           <w:rFonts w:ascii="Times New Roman" w:hAnsi="Times New Roman" w:cs="Times New Roman"/>
-          <w:sz w:val="24"/>
-          <w:szCs w:val="24"/>
+          <w:b/>
+          <w:sz w:val="32"/>
         </w:rPr>
         <w:t>ɒ</w:t>
       </w:r>
       <w:r>
         <w:rPr>
           <w:rFonts w:ascii="Times New Roman" w:hAnsi="Times New Roman" w:cs="Times New Roman" w:hint="eastAsia"/>
-          <w:sz w:val="24"/>
-          <w:szCs w:val="24"/>
+          <w:b/>
+          <w:sz w:val="32"/>
         </w:rPr>
         <w:t>/</w:t>
       </w:r>
@@ -2625,7 +2867,7 @@
     <w:p>
       <w:pPr>
         <w:rPr>
-          <w:rFonts w:ascii="Times New Roman" w:hAnsi="Times New Roman" w:cs="Times New Roman" w:hint="eastAsia"/>
+          <w:rFonts w:ascii="Times New Roman" w:hAnsi="Times New Roman" w:cs="Times New Roman"/>
           <w:sz w:val="24"/>
           <w:szCs w:val="24"/>
         </w:rPr>
@@ -2661,31 +2903,55 @@
           <w:sz w:val="24"/>
           <w:szCs w:val="24"/>
         </w:rPr>
-        <w:t xml:space="preserve">Your tongue is more backward than when you pronounce the Chinse </w:t>
-      </w:r>
-      <w:r>
-        <w:rPr>
-          <w:rFonts w:ascii="Times New Roman" w:hAnsi="Times New Roman" w:cs="Times New Roman"/>
-          <w:sz w:val="24"/>
-          <w:szCs w:val="24"/>
-        </w:rPr>
-        <w:t>“</w:t>
-      </w:r>
-      <w:r>
-        <w:rPr>
-          <w:rFonts w:ascii="Times New Roman" w:hAnsi="Times New Roman" w:cs="Times New Roman" w:hint="eastAsia"/>
-          <w:sz w:val="24"/>
-          <w:szCs w:val="24"/>
-        </w:rPr>
-        <w:t>o</w:t>
-      </w:r>
-      <w:r>
-        <w:rPr>
-          <w:rFonts w:ascii="Times New Roman" w:hAnsi="Times New Roman" w:cs="Times New Roman"/>
-          <w:sz w:val="24"/>
-          <w:szCs w:val="24"/>
-        </w:rPr>
-        <w:t>”</w:t>
+        <w:t>Note that it is not the</w:t>
+      </w:r>
+      <w:r>
+        <w:rPr>
+          <w:rFonts w:ascii="Times New Roman" w:hAnsi="Times New Roman" w:cs="Times New Roman" w:hint="eastAsia"/>
+          <w:sz w:val="24"/>
+          <w:szCs w:val="24"/>
+        </w:rPr>
+        <w:t xml:space="preserve"> /</w:t>
+      </w:r>
+      <w:r>
+        <w:rPr>
+          <w:rFonts w:ascii="Times New Roman" w:hAnsi="Times New Roman" w:cs="Times New Roman"/>
+          <w:sz w:val="24"/>
+          <w:szCs w:val="24"/>
+        </w:rPr>
+        <w:t>ɔ</w:t>
+      </w:r>
+      <w:r>
+        <w:rPr>
+          <w:rFonts w:ascii="Times New Roman" w:hAnsi="Times New Roman" w:cs="Times New Roman" w:hint="eastAsia"/>
+          <w:sz w:val="24"/>
+          <w:szCs w:val="24"/>
+        </w:rPr>
+        <w:t>/, which is the</w:t>
+      </w:r>
+      <w:r>
+        <w:rPr>
+          <w:rFonts w:ascii="Times New Roman" w:hAnsi="Times New Roman" w:cs="Times New Roman" w:hint="eastAsia"/>
+          <w:sz w:val="24"/>
+          <w:szCs w:val="24"/>
+        </w:rPr>
+        <w:t xml:space="preserve"> short version of /</w:t>
+      </w:r>
+      <w:r>
+        <w:rPr>
+          <w:rFonts w:ascii="Times New Roman" w:hAnsi="Times New Roman" w:cs="Times New Roman"/>
+          <w:sz w:val="24"/>
+          <w:szCs w:val="24"/>
+        </w:rPr>
+        <w:t>ɔ</w:t>
+      </w:r>
+      <w:r>
+        <w:rPr>
+          <w:rFonts w:ascii="Times New Roman" w:hAnsi="Times New Roman" w:cs="Times New Roman" w:hint="eastAsia"/>
+          <w:sz w:val="24"/>
+          <w:szCs w:val="24"/>
+        </w:rPr>
+        <w:t>:/</w:t>
       </w:r>
       <w:r>
         <w:rPr>
@@ -2701,24 +2967,7 @@
           <w:sz w:val="24"/>
           <w:szCs w:val="24"/>
         </w:rPr>
-        <w:t xml:space="preserve"> </w:t>
-      </w:r>
-    </w:p>
-    <w:p>
-      <w:pPr>
-        <w:rPr>
-          <w:rFonts w:ascii="Times New Roman" w:hAnsi="Times New Roman" w:cs="Times New Roman" w:hint="eastAsia"/>
-          <w:sz w:val="24"/>
-          <w:szCs w:val="24"/>
-        </w:rPr>
-      </w:pPr>
-      <w:r>
-        <w:rPr>
-          <w:rFonts w:ascii="Times New Roman" w:hAnsi="Times New Roman" w:cs="Times New Roman" w:hint="eastAsia"/>
-          <w:sz w:val="24"/>
-          <w:szCs w:val="24"/>
-        </w:rPr>
-        <w:t>Note that it is not the short version of /</w:t>
+        <w:t xml:space="preserve"> Your tongue is lower than /</w:t>
       </w:r>
       <w:r>
         <w:rPr>
@@ -2744,29 +2993,46 @@
         </w:rPr>
         <w:t>.</w:t>
       </w:r>
-      <w:r>
-        <w:rPr>
-          <w:rFonts w:ascii="Times New Roman" w:hAnsi="Times New Roman" w:cs="Times New Roman" w:hint="eastAsia"/>
-          <w:sz w:val="24"/>
-          <w:szCs w:val="24"/>
-        </w:rPr>
-        <w:t xml:space="preserve"> Your tongue is lower than /</w:t>
-      </w:r>
-      <w:r>
-        <w:rPr>
-          <w:rFonts w:ascii="Times New Roman" w:hAnsi="Times New Roman" w:cs="Times New Roman"/>
-          <w:sz w:val="24"/>
-          <w:szCs w:val="24"/>
-        </w:rPr>
-        <w:t>ɔ</w:t>
-      </w:r>
-      <w:r>
-        <w:rPr>
-          <w:rFonts w:ascii="Times New Roman" w:hAnsi="Times New Roman" w:cs="Times New Roman" w:hint="eastAsia"/>
-          <w:sz w:val="24"/>
-          <w:szCs w:val="24"/>
-        </w:rPr>
-        <w:t>:/</w:t>
+    </w:p>
+    <w:p>
+      <w:pPr>
+        <w:rPr>
+          <w:rFonts w:ascii="Times New Roman" w:hAnsi="Times New Roman" w:cs="Times New Roman"/>
+          <w:sz w:val="24"/>
+          <w:szCs w:val="24"/>
+        </w:rPr>
+      </w:pPr>
+      <w:r>
+        <w:rPr>
+          <w:rFonts w:ascii="Times New Roman" w:hAnsi="Times New Roman" w:cs="Times New Roman" w:hint="eastAsia"/>
+          <w:sz w:val="24"/>
+          <w:szCs w:val="24"/>
+        </w:rPr>
+        <w:t xml:space="preserve">For example, </w:t>
+      </w:r>
+      <w:r>
+        <w:rPr>
+          <w:rFonts w:ascii="Times New Roman" w:hAnsi="Times New Roman" w:cs="Times New Roman" w:hint="eastAsia"/>
+          <w:sz w:val="24"/>
+          <w:szCs w:val="24"/>
+        </w:rPr>
+        <w:t>top /</w:t>
+      </w:r>
+      <w:r>
+        <w:rPr>
+          <w:rFonts w:ascii="Times New Roman" w:hAnsi="Times New Roman" w:cs="Times New Roman"/>
+          <w:sz w:val="24"/>
+          <w:szCs w:val="24"/>
+        </w:rPr>
+        <w:t>ɒ</w:t>
+      </w:r>
+      <w:r>
+        <w:rPr>
+          <w:rFonts w:ascii="Times New Roman" w:hAnsi="Times New Roman" w:cs="Times New Roman" w:hint="eastAsia"/>
+          <w:sz w:val="24"/>
+          <w:szCs w:val="24"/>
+        </w:rPr>
+        <w:t>/</w:t>
       </w:r>
       <w:r>
         <w:rPr>
@@ -2776,22 +3042,22 @@
         </w:rPr>
         <w:t>.</w:t>
       </w:r>
-    </w:p>
-    <w:p>
-      <w:pPr>
-        <w:rPr>
-          <w:rFonts w:ascii="Times New Roman" w:hAnsi="Times New Roman" w:cs="Times New Roman"/>
-          <w:sz w:val="24"/>
-          <w:szCs w:val="24"/>
-        </w:rPr>
-      </w:pPr>
       <w:bookmarkStart w:id="0" w:name="_GoBack"/>
       <w:bookmarkEnd w:id="0"/>
     </w:p>
     <w:p>
       <w:pPr>
         <w:rPr>
-          <w:rFonts w:ascii="Times New Roman" w:hAnsi="Times New Roman" w:cs="Times New Roman" w:hint="eastAsia"/>
+          <w:rFonts w:ascii="Times New Roman" w:hAnsi="Times New Roman" w:cs="Times New Roman"/>
+          <w:sz w:val="24"/>
+          <w:szCs w:val="24"/>
+        </w:rPr>
+      </w:pPr>
+    </w:p>
+    <w:p>
+      <w:pPr>
+        <w:rPr>
+          <w:rFonts w:ascii="Times New Roman" w:hAnsi="Times New Roman" w:cs="Times New Roman"/>
           <w:sz w:val="24"/>
           <w:szCs w:val="24"/>
         </w:rPr>
@@ -3803,7 +4069,7 @@
 </file>
 
 <file path=customXml/itemProps1.xml><?xml version="1.0" encoding="utf-8"?>
-<ds:datastoreItem xmlns:ds="http://schemas.openxmlformats.org/officeDocument/2006/customXml" ds:itemID="{642AFC57-CFC0-4156-9D03-E312F5A7EBBB}">
+<ds:datastoreItem xmlns:ds="http://schemas.openxmlformats.org/officeDocument/2006/customXml" ds:itemID="{59F2DF15-DB36-4321-A08A-2584575122AA}">
   <ds:schemaRefs>
     <ds:schemaRef ds:uri="http://schemas.openxmlformats.org/officeDocument/2006/bibliography"/>
   </ds:schemaRefs>

</xml_diff>